<commit_message>
Adiciona capítulo Glossário e Siglas ao Product Report do NetGraph
Último capítulo do documento, em ordem alfabética: 24 termos cobrindo
a hierarquia de rede (POP, OLT, PON, CTO, ONT, SPOF), modelos
analíticos (Markov, Bayes, MAD, regressão linear, blast radius) e
normas de assurance (RQUAL, Selo Anatel, ITU-T M.3400, FCAPS, eTOM,
TMF628/TMF642) — verificados contra netgraph/index.html.
</commit_message>
<xml_diff>
--- a/docs/produtos/netgraph-product-report.docx
+++ b/docs/produtos/netgraph-product-report.docx
@@ -422,6 +422,31 @@
           <w:szCs w:val="22"/>
         </w:rPr>
         <w:t xml:space="preserve">	13</w:t>
+      </w:r>
+    </w:p>
+    <w:p>
+      <w:pPr>
+        <w:tabs>
+          <w:tab w:val="right" w:pos="9026" w:leader="dot"/>
+        </w:tabs>
+        <w:spacing w:after="100"/>
+        <w:ind w:left="0"/>
+      </w:pPr>
+      <w:r>
+        <w:rPr>
+          <w:b/>
+          <w:bCs/>
+          <w:sz w:val="22"/>
+          <w:szCs w:val="22"/>
+        </w:rPr>
+        <w:t xml:space="preserve">Glossário e Siglas</w:t>
+      </w:r>
+      <w:r>
+        <w:rPr>
+          <w:sz w:val="22"/>
+          <w:szCs w:val="22"/>
+        </w:rPr>
+        <w:t xml:space="preserve">	14</w:t>
       </w:r>
     </w:p>
     <w:p>
@@ -7101,6 +7126,2692 @@
         </w:tc>
       </w:tr>
     </w:tbl>
+    <w:p>
+      <w:pPr>
+        <w:pStyle w:val="Heading1"/>
+      </w:pPr>
+      <w:r>
+        <w:t xml:space="preserve">Glossário e Siglas</w:t>
+      </w:r>
+    </w:p>
+    <w:p>
+      <w:pPr>
+        <w:spacing w:after="200" w:before="0"/>
+        <w:jc w:val="both"/>
+      </w:pPr>
+      <w:r>
+        <w:rPr>
+          <w:b w:val="false"/>
+          <w:bCs w:val="false"/>
+          <w:i w:val="false"/>
+          <w:iCs w:val="false"/>
+        </w:rPr>
+        <w:t xml:space="preserve">Consolida, em ordem alfabética, as siglas de rede/telecom, os modelos analíticos e os frameworks setoriais efetivamente citados no corpus técnico do NetGraph — o produto que, entre os cinco desta série, mais depende de vocabulário de engenharia de rede e de normas Anatel/ITU-T/TM Forum.</w:t>
+      </w:r>
+    </w:p>
+    <w:tbl>
+      <w:tblPr>
+        <w:tblW w:type="dxa" w:w="9360"/>
+        <w:tblBorders>
+          <w:top w:val="single" w:color="auto" w:sz="4"/>
+          <w:left w:val="single" w:color="auto" w:sz="4"/>
+          <w:bottom w:val="single" w:color="auto" w:sz="4"/>
+          <w:right w:val="single" w:color="auto" w:sz="4"/>
+          <w:insideH w:val="single" w:color="auto" w:sz="4"/>
+          <w:insideV w:val="single" w:color="auto" w:sz="4"/>
+        </w:tblBorders>
+      </w:tblPr>
+      <w:tblGrid>
+        <w:gridCol w:w="2100"/>
+        <w:gridCol w:w="1500"/>
+        <w:gridCol w:w="5760"/>
+      </w:tblGrid>
+      <w:tr>
+        <w:tc>
+          <w:tcPr>
+            <w:tcW w:type="dxa" w:w="2100"/>
+            <w:tcBorders>
+              <w:top w:val="single" w:color="CCCCCC" w:sz="4"/>
+              <w:left w:val="single" w:color="CCCCCC" w:sz="4"/>
+              <w:bottom w:val="single" w:color="CCCCCC" w:sz="4"/>
+              <w:right w:val="single" w:color="CCCCCC" w:sz="4"/>
+            </w:tcBorders>
+            <w:shd w:fill="1F4E79" w:val="clear"/>
+            <w:tcMar>
+              <w:top w:type="dxa" w:w="100"/>
+              <w:left w:type="dxa" w:w="120"/>
+              <w:bottom w:type="dxa" w:w="100"/>
+              <w:right w:type="dxa" w:w="120"/>
+            </w:tcMar>
+            <w:vAlign w:val="center"/>
+          </w:tcPr>
+          <w:p>
+            <w:pPr>
+              <w:jc w:val="left"/>
+            </w:pPr>
+            <w:r>
+              <w:rPr>
+                <w:b/>
+                <w:bCs/>
+                <w:i w:val="false"/>
+                <w:iCs w:val="false"/>
+                <w:color w:val="FFFFFF"/>
+                <w:sz w:val="19"/>
+                <w:szCs w:val="19"/>
+              </w:rPr>
+              <w:t xml:space="preserve">Termo</w:t>
+            </w:r>
+          </w:p>
+        </w:tc>
+        <w:tc>
+          <w:tcPr>
+            <w:tcW w:type="dxa" w:w="1500"/>
+            <w:tcBorders>
+              <w:top w:val="single" w:color="CCCCCC" w:sz="4"/>
+              <w:left w:val="single" w:color="CCCCCC" w:sz="4"/>
+              <w:bottom w:val="single" w:color="CCCCCC" w:sz="4"/>
+              <w:right w:val="single" w:color="CCCCCC" w:sz="4"/>
+            </w:tcBorders>
+            <w:shd w:fill="1F4E79" w:val="clear"/>
+            <w:tcMar>
+              <w:top w:type="dxa" w:w="100"/>
+              <w:left w:type="dxa" w:w="120"/>
+              <w:bottom w:type="dxa" w:w="100"/>
+              <w:right w:type="dxa" w:w="120"/>
+            </w:tcMar>
+            <w:vAlign w:val="center"/>
+          </w:tcPr>
+          <w:p>
+            <w:pPr>
+              <w:jc w:val="left"/>
+            </w:pPr>
+            <w:r>
+              <w:rPr>
+                <w:b/>
+                <w:bCs/>
+                <w:i w:val="false"/>
+                <w:iCs w:val="false"/>
+                <w:color w:val="FFFFFF"/>
+                <w:sz w:val="19"/>
+                <w:szCs w:val="19"/>
+              </w:rPr>
+              <w:t xml:space="preserve">Categoria</w:t>
+            </w:r>
+          </w:p>
+        </w:tc>
+        <w:tc>
+          <w:tcPr>
+            <w:tcW w:type="dxa" w:w="5760"/>
+            <w:tcBorders>
+              <w:top w:val="single" w:color="CCCCCC" w:sz="4"/>
+              <w:left w:val="single" w:color="CCCCCC" w:sz="4"/>
+              <w:bottom w:val="single" w:color="CCCCCC" w:sz="4"/>
+              <w:right w:val="single" w:color="CCCCCC" w:sz="4"/>
+            </w:tcBorders>
+            <w:shd w:fill="1F4E79" w:val="clear"/>
+            <w:tcMar>
+              <w:top w:type="dxa" w:w="100"/>
+              <w:left w:type="dxa" w:w="120"/>
+              <w:bottom w:type="dxa" w:w="100"/>
+              <w:right w:type="dxa" w:w="120"/>
+            </w:tcMar>
+            <w:vAlign w:val="center"/>
+          </w:tcPr>
+          <w:p>
+            <w:pPr>
+              <w:jc w:val="left"/>
+            </w:pPr>
+            <w:r>
+              <w:rPr>
+                <w:b/>
+                <w:bCs/>
+                <w:i w:val="false"/>
+                <w:iCs w:val="false"/>
+                <w:color w:val="FFFFFF"/>
+                <w:sz w:val="19"/>
+                <w:szCs w:val="19"/>
+              </w:rPr>
+              <w:t xml:space="preserve">Definição</w:t>
+            </w:r>
+          </w:p>
+        </w:tc>
+      </w:tr>
+      <w:tr>
+        <w:tc>
+          <w:tcPr>
+            <w:tcW w:type="dxa" w:w="2100"/>
+            <w:tcBorders>
+              <w:top w:val="single" w:color="CCCCCC" w:sz="4"/>
+              <w:left w:val="single" w:color="CCCCCC" w:sz="4"/>
+              <w:bottom w:val="single" w:color="CCCCCC" w:sz="4"/>
+              <w:right w:val="single" w:color="CCCCCC" w:sz="4"/>
+            </w:tcBorders>
+            <w:tcMar>
+              <w:top w:type="dxa" w:w="100"/>
+              <w:left w:type="dxa" w:w="120"/>
+              <w:bottom w:type="dxa" w:w="100"/>
+              <w:right w:type="dxa" w:w="120"/>
+            </w:tcMar>
+            <w:vAlign w:val="center"/>
+          </w:tcPr>
+          <w:p>
+            <w:pPr>
+              <w:jc w:val="left"/>
+            </w:pPr>
+            <w:r>
+              <w:rPr>
+                <w:b/>
+                <w:bCs/>
+                <w:i w:val="false"/>
+                <w:iCs w:val="false"/>
+                <w:sz w:val="19"/>
+                <w:szCs w:val="19"/>
+              </w:rPr>
+              <w:t xml:space="preserve">Anatel</w:t>
+            </w:r>
+          </w:p>
+        </w:tc>
+        <w:tc>
+          <w:tcPr>
+            <w:tcW w:type="dxa" w:w="1500"/>
+            <w:tcBorders>
+              <w:top w:val="single" w:color="CCCCCC" w:sz="4"/>
+              <w:left w:val="single" w:color="CCCCCC" w:sz="4"/>
+              <w:bottom w:val="single" w:color="CCCCCC" w:sz="4"/>
+              <w:right w:val="single" w:color="CCCCCC" w:sz="4"/>
+            </w:tcBorders>
+            <w:tcMar>
+              <w:top w:type="dxa" w:w="100"/>
+              <w:left w:type="dxa" w:w="120"/>
+              <w:bottom w:type="dxa" w:w="100"/>
+              <w:right w:type="dxa" w:w="120"/>
+            </w:tcMar>
+            <w:vAlign w:val="center"/>
+          </w:tcPr>
+          <w:p>
+            <w:pPr>
+              <w:jc w:val="left"/>
+            </w:pPr>
+            <w:r>
+              <w:rPr>
+                <w:b w:val="false"/>
+                <w:bCs w:val="false"/>
+                <w:i w:val="false"/>
+                <w:iCs w:val="false"/>
+                <w:color w:val="4A6A8A"/>
+                <w:sz w:val="19"/>
+                <w:szCs w:val="19"/>
+              </w:rPr>
+              <w:t xml:space="preserve">Sigla</w:t>
+            </w:r>
+          </w:p>
+        </w:tc>
+        <w:tc>
+          <w:tcPr>
+            <w:tcW w:type="dxa" w:w="5760"/>
+            <w:tcBorders>
+              <w:top w:val="single" w:color="CCCCCC" w:sz="4"/>
+              <w:left w:val="single" w:color="CCCCCC" w:sz="4"/>
+              <w:bottom w:val="single" w:color="CCCCCC" w:sz="4"/>
+              <w:right w:val="single" w:color="CCCCCC" w:sz="4"/>
+            </w:tcBorders>
+            <w:tcMar>
+              <w:top w:type="dxa" w:w="100"/>
+              <w:left w:type="dxa" w:w="120"/>
+              <w:bottom w:type="dxa" w:w="100"/>
+              <w:right w:type="dxa" w:w="120"/>
+            </w:tcMar>
+            <w:vAlign w:val="center"/>
+          </w:tcPr>
+          <w:p>
+            <w:pPr>
+              <w:jc w:val="left"/>
+            </w:pPr>
+            <w:r>
+              <w:rPr>
+                <w:b w:val="false"/>
+                <w:bCs w:val="false"/>
+                <w:i w:val="false"/>
+                <w:iCs w:val="false"/>
+                <w:sz w:val="19"/>
+                <w:szCs w:val="19"/>
+              </w:rPr>
+              <w:t xml:space="preserve">Agência Nacional de Telecomunicações — órgão regulador citado no RQUAL, Selo de Qualidade e escalonamento de alertas.</w:t>
+            </w:r>
+          </w:p>
+        </w:tc>
+      </w:tr>
+      <w:tr>
+        <w:tc>
+          <w:tcPr>
+            <w:tcW w:type="dxa" w:w="2100"/>
+            <w:tcBorders>
+              <w:top w:val="single" w:color="CCCCCC" w:sz="4"/>
+              <w:left w:val="single" w:color="CCCCCC" w:sz="4"/>
+              <w:bottom w:val="single" w:color="CCCCCC" w:sz="4"/>
+              <w:right w:val="single" w:color="CCCCCC" w:sz="4"/>
+            </w:tcBorders>
+            <w:tcMar>
+              <w:top w:type="dxa" w:w="100"/>
+              <w:left w:type="dxa" w:w="120"/>
+              <w:bottom w:type="dxa" w:w="100"/>
+              <w:right w:type="dxa" w:w="120"/>
+            </w:tcMar>
+            <w:vAlign w:val="center"/>
+          </w:tcPr>
+          <w:p>
+            <w:pPr>
+              <w:jc w:val="left"/>
+            </w:pPr>
+            <w:r>
+              <w:rPr>
+                <w:b/>
+                <w:bCs/>
+                <w:i w:val="false"/>
+                <w:iCs w:val="false"/>
+                <w:sz w:val="19"/>
+                <w:szCs w:val="19"/>
+              </w:rPr>
+              <w:t xml:space="preserve">Bayes (Rede Bayesiana)</w:t>
+            </w:r>
+          </w:p>
+        </w:tc>
+        <w:tc>
+          <w:tcPr>
+            <w:tcW w:type="dxa" w:w="1500"/>
+            <w:tcBorders>
+              <w:top w:val="single" w:color="CCCCCC" w:sz="4"/>
+              <w:left w:val="single" w:color="CCCCCC" w:sz="4"/>
+              <w:bottom w:val="single" w:color="CCCCCC" w:sz="4"/>
+              <w:right w:val="single" w:color="CCCCCC" w:sz="4"/>
+            </w:tcBorders>
+            <w:tcMar>
+              <w:top w:type="dxa" w:w="100"/>
+              <w:left w:type="dxa" w:w="120"/>
+              <w:bottom w:type="dxa" w:w="100"/>
+              <w:right w:type="dxa" w:w="120"/>
+            </w:tcMar>
+            <w:vAlign w:val="center"/>
+          </w:tcPr>
+          <w:p>
+            <w:pPr>
+              <w:jc w:val="left"/>
+            </w:pPr>
+            <w:r>
+              <w:rPr>
+                <w:b w:val="false"/>
+                <w:bCs w:val="false"/>
+                <w:i w:val="false"/>
+                <w:iCs w:val="false"/>
+                <w:color w:val="4A6A8A"/>
+                <w:sz w:val="19"/>
+                <w:szCs w:val="19"/>
+              </w:rPr>
+              <w:t xml:space="preserve">Modelo/Técnica</w:t>
+            </w:r>
+          </w:p>
+        </w:tc>
+        <w:tc>
+          <w:tcPr>
+            <w:tcW w:type="dxa" w:w="5760"/>
+            <w:tcBorders>
+              <w:top w:val="single" w:color="CCCCCC" w:sz="4"/>
+              <w:left w:val="single" w:color="CCCCCC" w:sz="4"/>
+              <w:bottom w:val="single" w:color="CCCCCC" w:sz="4"/>
+              <w:right w:val="single" w:color="CCCCCC" w:sz="4"/>
+            </w:tcBorders>
+            <w:tcMar>
+              <w:top w:type="dxa" w:w="100"/>
+              <w:left w:type="dxa" w:w="120"/>
+              <w:bottom w:type="dxa" w:w="100"/>
+              <w:right w:type="dxa" w:w="120"/>
+            </w:tcMar>
+            <w:vAlign w:val="center"/>
+          </w:tcPr>
+          <w:p>
+            <w:pPr>
+              <w:jc w:val="left"/>
+            </w:pPr>
+            <w:r>
+              <w:rPr>
+                <w:b w:val="false"/>
+                <w:bCs w:val="false"/>
+                <w:i w:val="false"/>
+                <w:iCs w:val="false"/>
+                <w:sz w:val="19"/>
+                <w:szCs w:val="19"/>
+              </w:rPr>
+              <w:t xml:space="preserve">Rede Bayesiana simplificada (naive Bayes) com posterior calculado sobre 6 causas candidatas nomeadas (rompimento de fibra, falha de energia, sobrecarga de OLT etc.), a partir de priors e uma tabela de likelihood sobre 8 evidências.</w:t>
+            </w:r>
+          </w:p>
+        </w:tc>
+      </w:tr>
+      <w:tr>
+        <w:tc>
+          <w:tcPr>
+            <w:tcW w:type="dxa" w:w="2100"/>
+            <w:tcBorders>
+              <w:top w:val="single" w:color="CCCCCC" w:sz="4"/>
+              <w:left w:val="single" w:color="CCCCCC" w:sz="4"/>
+              <w:bottom w:val="single" w:color="CCCCCC" w:sz="4"/>
+              <w:right w:val="single" w:color="CCCCCC" w:sz="4"/>
+            </w:tcBorders>
+            <w:tcMar>
+              <w:top w:type="dxa" w:w="100"/>
+              <w:left w:type="dxa" w:w="120"/>
+              <w:bottom w:type="dxa" w:w="100"/>
+              <w:right w:type="dxa" w:w="120"/>
+            </w:tcMar>
+            <w:vAlign w:val="center"/>
+          </w:tcPr>
+          <w:p>
+            <w:pPr>
+              <w:jc w:val="left"/>
+            </w:pPr>
+            <w:r>
+              <w:rPr>
+                <w:b/>
+                <w:bCs/>
+                <w:i w:val="false"/>
+                <w:iCs w:val="false"/>
+                <w:sz w:val="19"/>
+                <w:szCs w:val="19"/>
+              </w:rPr>
+              <w:t xml:space="preserve">Blast Radius</w:t>
+            </w:r>
+          </w:p>
+        </w:tc>
+        <w:tc>
+          <w:tcPr>
+            <w:tcW w:type="dxa" w:w="1500"/>
+            <w:tcBorders>
+              <w:top w:val="single" w:color="CCCCCC" w:sz="4"/>
+              <w:left w:val="single" w:color="CCCCCC" w:sz="4"/>
+              <w:bottom w:val="single" w:color="CCCCCC" w:sz="4"/>
+              <w:right w:val="single" w:color="CCCCCC" w:sz="4"/>
+            </w:tcBorders>
+            <w:tcMar>
+              <w:top w:type="dxa" w:w="100"/>
+              <w:left w:type="dxa" w:w="120"/>
+              <w:bottom w:type="dxa" w:w="100"/>
+              <w:right w:type="dxa" w:w="120"/>
+            </w:tcMar>
+            <w:vAlign w:val="center"/>
+          </w:tcPr>
+          <w:p>
+            <w:pPr>
+              <w:jc w:val="left"/>
+            </w:pPr>
+            <w:r>
+              <w:rPr>
+                <w:b w:val="false"/>
+                <w:bCs w:val="false"/>
+                <w:i w:val="false"/>
+                <w:iCs w:val="false"/>
+                <w:color w:val="4A6A8A"/>
+                <w:sz w:val="19"/>
+                <w:szCs w:val="19"/>
+              </w:rPr>
+              <w:t xml:space="preserve">Modelo/Técnica</w:t>
+            </w:r>
+          </w:p>
+        </w:tc>
+        <w:tc>
+          <w:tcPr>
+            <w:tcW w:type="dxa" w:w="5760"/>
+            <w:tcBorders>
+              <w:top w:val="single" w:color="CCCCCC" w:sz="4"/>
+              <w:left w:val="single" w:color="CCCCCC" w:sz="4"/>
+              <w:bottom w:val="single" w:color="CCCCCC" w:sz="4"/>
+              <w:right w:val="single" w:color="CCCCCC" w:sz="4"/>
+            </w:tcBorders>
+            <w:tcMar>
+              <w:top w:type="dxa" w:w="100"/>
+              <w:left w:type="dxa" w:w="120"/>
+              <w:bottom w:type="dxa" w:w="100"/>
+              <w:right w:type="dxa" w:w="120"/>
+            </w:tcMar>
+            <w:vAlign w:val="center"/>
+          </w:tcPr>
+          <w:p>
+            <w:pPr>
+              <w:jc w:val="left"/>
+            </w:pPr>
+            <w:r>
+              <w:rPr>
+                <w:b w:val="false"/>
+                <w:bCs w:val="false"/>
+                <w:i w:val="false"/>
+                <w:iCs w:val="false"/>
+                <w:sz w:val="19"/>
+                <w:szCs w:val="19"/>
+              </w:rPr>
+              <w:t xml:space="preserve">Travessia de grafo (BFS/DFS) a partir de um nó em falha, contando nós e assinantes downstream afetados de fato — base estrutural, não estatística.</w:t>
+            </w:r>
+          </w:p>
+        </w:tc>
+      </w:tr>
+      <w:tr>
+        <w:tc>
+          <w:tcPr>
+            <w:tcW w:type="dxa" w:w="2100"/>
+            <w:tcBorders>
+              <w:top w:val="single" w:color="CCCCCC" w:sz="4"/>
+              <w:left w:val="single" w:color="CCCCCC" w:sz="4"/>
+              <w:bottom w:val="single" w:color="CCCCCC" w:sz="4"/>
+              <w:right w:val="single" w:color="CCCCCC" w:sz="4"/>
+            </w:tcBorders>
+            <w:tcMar>
+              <w:top w:type="dxa" w:w="100"/>
+              <w:left w:type="dxa" w:w="120"/>
+              <w:bottom w:type="dxa" w:w="100"/>
+              <w:right w:type="dxa" w:w="120"/>
+            </w:tcMar>
+            <w:vAlign w:val="center"/>
+          </w:tcPr>
+          <w:p>
+            <w:pPr>
+              <w:jc w:val="left"/>
+            </w:pPr>
+            <w:r>
+              <w:rPr>
+                <w:b/>
+                <w:bCs/>
+                <w:i w:val="false"/>
+                <w:iCs w:val="false"/>
+                <w:sz w:val="19"/>
+                <w:szCs w:val="19"/>
+              </w:rPr>
+              <w:t xml:space="preserve">CRM</w:t>
+            </w:r>
+          </w:p>
+        </w:tc>
+        <w:tc>
+          <w:tcPr>
+            <w:tcW w:type="dxa" w:w="1500"/>
+            <w:tcBorders>
+              <w:top w:val="single" w:color="CCCCCC" w:sz="4"/>
+              <w:left w:val="single" w:color="CCCCCC" w:sz="4"/>
+              <w:bottom w:val="single" w:color="CCCCCC" w:sz="4"/>
+              <w:right w:val="single" w:color="CCCCCC" w:sz="4"/>
+            </w:tcBorders>
+            <w:tcMar>
+              <w:top w:type="dxa" w:w="100"/>
+              <w:left w:type="dxa" w:w="120"/>
+              <w:bottom w:type="dxa" w:w="100"/>
+              <w:right w:type="dxa" w:w="120"/>
+            </w:tcMar>
+            <w:vAlign w:val="center"/>
+          </w:tcPr>
+          <w:p>
+            <w:pPr>
+              <w:jc w:val="left"/>
+            </w:pPr>
+            <w:r>
+              <w:rPr>
+                <w:b w:val="false"/>
+                <w:bCs w:val="false"/>
+                <w:i w:val="false"/>
+                <w:iCs w:val="false"/>
+                <w:color w:val="4A6A8A"/>
+                <w:sz w:val="19"/>
+                <w:szCs w:val="19"/>
+              </w:rPr>
+              <w:t xml:space="preserve">Sigla</w:t>
+            </w:r>
+          </w:p>
+        </w:tc>
+        <w:tc>
+          <w:tcPr>
+            <w:tcW w:type="dxa" w:w="5760"/>
+            <w:tcBorders>
+              <w:top w:val="single" w:color="CCCCCC" w:sz="4"/>
+              <w:left w:val="single" w:color="CCCCCC" w:sz="4"/>
+              <w:bottom w:val="single" w:color="CCCCCC" w:sz="4"/>
+              <w:right w:val="single" w:color="CCCCCC" w:sz="4"/>
+            </w:tcBorders>
+            <w:tcMar>
+              <w:top w:type="dxa" w:w="100"/>
+              <w:left w:type="dxa" w:w="120"/>
+              <w:bottom w:type="dxa" w:w="100"/>
+              <w:right w:type="dxa" w:w="120"/>
+            </w:tcMar>
+            <w:vAlign w:val="center"/>
+          </w:tcPr>
+          <w:p>
+            <w:pPr>
+              <w:jc w:val="left"/>
+            </w:pPr>
+            <w:r>
+              <w:rPr>
+                <w:b w:val="false"/>
+                <w:bCs w:val="false"/>
+                <w:i w:val="false"/>
+                <w:iCs w:val="false"/>
+                <w:sz w:val="19"/>
+                <w:szCs w:val="19"/>
+              </w:rPr>
+              <w:t xml:space="preserve">Customer Relationship Management — volume sintético de reclamações de Call Center por zona/nó, cruzado por timestamp com alertas de rede.</w:t>
+            </w:r>
+          </w:p>
+        </w:tc>
+      </w:tr>
+      <w:tr>
+        <w:tc>
+          <w:tcPr>
+            <w:tcW w:type="dxa" w:w="2100"/>
+            <w:tcBorders>
+              <w:top w:val="single" w:color="CCCCCC" w:sz="4"/>
+              <w:left w:val="single" w:color="CCCCCC" w:sz="4"/>
+              <w:bottom w:val="single" w:color="CCCCCC" w:sz="4"/>
+              <w:right w:val="single" w:color="CCCCCC" w:sz="4"/>
+            </w:tcBorders>
+            <w:tcMar>
+              <w:top w:type="dxa" w:w="100"/>
+              <w:left w:type="dxa" w:w="120"/>
+              <w:bottom w:type="dxa" w:w="100"/>
+              <w:right w:type="dxa" w:w="120"/>
+            </w:tcMar>
+            <w:vAlign w:val="center"/>
+          </w:tcPr>
+          <w:p>
+            <w:pPr>
+              <w:jc w:val="left"/>
+            </w:pPr>
+            <w:r>
+              <w:rPr>
+                <w:b/>
+                <w:bCs/>
+                <w:i w:val="false"/>
+                <w:iCs w:val="false"/>
+                <w:sz w:val="19"/>
+                <w:szCs w:val="19"/>
+              </w:rPr>
+              <w:t xml:space="preserve">CTO</w:t>
+            </w:r>
+          </w:p>
+        </w:tc>
+        <w:tc>
+          <w:tcPr>
+            <w:tcW w:type="dxa" w:w="1500"/>
+            <w:tcBorders>
+              <w:top w:val="single" w:color="CCCCCC" w:sz="4"/>
+              <w:left w:val="single" w:color="CCCCCC" w:sz="4"/>
+              <w:bottom w:val="single" w:color="CCCCCC" w:sz="4"/>
+              <w:right w:val="single" w:color="CCCCCC" w:sz="4"/>
+            </w:tcBorders>
+            <w:tcMar>
+              <w:top w:type="dxa" w:w="100"/>
+              <w:left w:type="dxa" w:w="120"/>
+              <w:bottom w:type="dxa" w:w="100"/>
+              <w:right w:type="dxa" w:w="120"/>
+            </w:tcMar>
+            <w:vAlign w:val="center"/>
+          </w:tcPr>
+          <w:p>
+            <w:pPr>
+              <w:jc w:val="left"/>
+            </w:pPr>
+            <w:r>
+              <w:rPr>
+                <w:b w:val="false"/>
+                <w:bCs w:val="false"/>
+                <w:i w:val="false"/>
+                <w:iCs w:val="false"/>
+                <w:color w:val="4A6A8A"/>
+                <w:sz w:val="19"/>
+                <w:szCs w:val="19"/>
+              </w:rPr>
+              <w:t xml:space="preserve">Sigla</w:t>
+            </w:r>
+          </w:p>
+        </w:tc>
+        <w:tc>
+          <w:tcPr>
+            <w:tcW w:type="dxa" w:w="5760"/>
+            <w:tcBorders>
+              <w:top w:val="single" w:color="CCCCCC" w:sz="4"/>
+              <w:left w:val="single" w:color="CCCCCC" w:sz="4"/>
+              <w:bottom w:val="single" w:color="CCCCCC" w:sz="4"/>
+              <w:right w:val="single" w:color="CCCCCC" w:sz="4"/>
+            </w:tcBorders>
+            <w:tcMar>
+              <w:top w:type="dxa" w:w="100"/>
+              <w:left w:type="dxa" w:w="120"/>
+              <w:bottom w:type="dxa" w:w="100"/>
+              <w:right w:type="dxa" w:w="120"/>
+            </w:tcMar>
+            <w:vAlign w:val="center"/>
+          </w:tcPr>
+          <w:p>
+            <w:pPr>
+              <w:jc w:val="left"/>
+            </w:pPr>
+            <w:r>
+              <w:rPr>
+                <w:b w:val="false"/>
+                <w:bCs w:val="false"/>
+                <w:i w:val="false"/>
+                <w:iCs w:val="false"/>
+                <w:sz w:val="19"/>
+                <w:szCs w:val="19"/>
+              </w:rPr>
+              <w:t xml:space="preserve">Caixa de Terminação Óptica — nível hierárquico da rede entre PON/Splitter e ONT (2–5 por PON, 8/16 portas).</w:t>
+            </w:r>
+          </w:p>
+        </w:tc>
+      </w:tr>
+      <w:tr>
+        <w:tc>
+          <w:tcPr>
+            <w:tcW w:type="dxa" w:w="2100"/>
+            <w:tcBorders>
+              <w:top w:val="single" w:color="CCCCCC" w:sz="4"/>
+              <w:left w:val="single" w:color="CCCCCC" w:sz="4"/>
+              <w:bottom w:val="single" w:color="CCCCCC" w:sz="4"/>
+              <w:right w:val="single" w:color="CCCCCC" w:sz="4"/>
+            </w:tcBorders>
+            <w:tcMar>
+              <w:top w:type="dxa" w:w="100"/>
+              <w:left w:type="dxa" w:w="120"/>
+              <w:bottom w:type="dxa" w:w="100"/>
+              <w:right w:type="dxa" w:w="120"/>
+            </w:tcMar>
+            <w:vAlign w:val="center"/>
+          </w:tcPr>
+          <w:p>
+            <w:pPr>
+              <w:jc w:val="left"/>
+            </w:pPr>
+            <w:r>
+              <w:rPr>
+                <w:b/>
+                <w:bCs/>
+                <w:i w:val="false"/>
+                <w:iCs w:val="false"/>
+                <w:sz w:val="19"/>
+                <w:szCs w:val="19"/>
+              </w:rPr>
+              <w:t xml:space="preserve">eTOM</w:t>
+            </w:r>
+          </w:p>
+        </w:tc>
+        <w:tc>
+          <w:tcPr>
+            <w:tcW w:type="dxa" w:w="1500"/>
+            <w:tcBorders>
+              <w:top w:val="single" w:color="CCCCCC" w:sz="4"/>
+              <w:left w:val="single" w:color="CCCCCC" w:sz="4"/>
+              <w:bottom w:val="single" w:color="CCCCCC" w:sz="4"/>
+              <w:right w:val="single" w:color="CCCCCC" w:sz="4"/>
+            </w:tcBorders>
+            <w:tcMar>
+              <w:top w:type="dxa" w:w="100"/>
+              <w:left w:type="dxa" w:w="120"/>
+              <w:bottom w:type="dxa" w:w="100"/>
+              <w:right w:type="dxa" w:w="120"/>
+            </w:tcMar>
+            <w:vAlign w:val="center"/>
+          </w:tcPr>
+          <w:p>
+            <w:pPr>
+              <w:jc w:val="left"/>
+            </w:pPr>
+            <w:r>
+              <w:rPr>
+                <w:b w:val="false"/>
+                <w:bCs w:val="false"/>
+                <w:i w:val="false"/>
+                <w:iCs w:val="false"/>
+                <w:color w:val="4A6A8A"/>
+                <w:sz w:val="19"/>
+                <w:szCs w:val="19"/>
+              </w:rPr>
+              <w:t xml:space="preserve">Norma/Framework</w:t>
+            </w:r>
+          </w:p>
+        </w:tc>
+        <w:tc>
+          <w:tcPr>
+            <w:tcW w:type="dxa" w:w="5760"/>
+            <w:tcBorders>
+              <w:top w:val="single" w:color="CCCCCC" w:sz="4"/>
+              <w:left w:val="single" w:color="CCCCCC" w:sz="4"/>
+              <w:bottom w:val="single" w:color="CCCCCC" w:sz="4"/>
+              <w:right w:val="single" w:color="CCCCCC" w:sz="4"/>
+            </w:tcBorders>
+            <w:tcMar>
+              <w:top w:type="dxa" w:w="100"/>
+              <w:left w:type="dxa" w:w="120"/>
+              <w:bottom w:type="dxa" w:w="100"/>
+              <w:right w:type="dxa" w:w="120"/>
+            </w:tcMar>
+            <w:vAlign w:val="center"/>
+          </w:tcPr>
+          <w:p>
+            <w:pPr>
+              <w:jc w:val="left"/>
+            </w:pPr>
+            <w:r>
+              <w:rPr>
+                <w:b w:val="false"/>
+                <w:bCs w:val="false"/>
+                <w:i w:val="false"/>
+                <w:iCs w:val="false"/>
+                <w:sz w:val="19"/>
+                <w:szCs w:val="19"/>
+              </w:rPr>
+              <w:t xml:space="preserve">Enhanced Telecom Operations Map (TM Forum GB921, incorporado pela ITU-T na série M.3050); mapeado ao processo vertical Assurance (Problem Handling, Service Quality Management, Resource Trouble Management).</w:t>
+            </w:r>
+          </w:p>
+        </w:tc>
+      </w:tr>
+      <w:tr>
+        <w:tc>
+          <w:tcPr>
+            <w:tcW w:type="dxa" w:w="2100"/>
+            <w:tcBorders>
+              <w:top w:val="single" w:color="CCCCCC" w:sz="4"/>
+              <w:left w:val="single" w:color="CCCCCC" w:sz="4"/>
+              <w:bottom w:val="single" w:color="CCCCCC" w:sz="4"/>
+              <w:right w:val="single" w:color="CCCCCC" w:sz="4"/>
+            </w:tcBorders>
+            <w:tcMar>
+              <w:top w:type="dxa" w:w="100"/>
+              <w:left w:type="dxa" w:w="120"/>
+              <w:bottom w:type="dxa" w:w="100"/>
+              <w:right w:type="dxa" w:w="120"/>
+            </w:tcMar>
+            <w:vAlign w:val="center"/>
+          </w:tcPr>
+          <w:p>
+            <w:pPr>
+              <w:jc w:val="left"/>
+            </w:pPr>
+            <w:r>
+              <w:rPr>
+                <w:b/>
+                <w:bCs/>
+                <w:i w:val="false"/>
+                <w:iCs w:val="false"/>
+                <w:sz w:val="19"/>
+                <w:szCs w:val="19"/>
+              </w:rPr>
+              <w:t xml:space="preserve">FCAPS</w:t>
+            </w:r>
+          </w:p>
+        </w:tc>
+        <w:tc>
+          <w:tcPr>
+            <w:tcW w:type="dxa" w:w="1500"/>
+            <w:tcBorders>
+              <w:top w:val="single" w:color="CCCCCC" w:sz="4"/>
+              <w:left w:val="single" w:color="CCCCCC" w:sz="4"/>
+              <w:bottom w:val="single" w:color="CCCCCC" w:sz="4"/>
+              <w:right w:val="single" w:color="CCCCCC" w:sz="4"/>
+            </w:tcBorders>
+            <w:tcMar>
+              <w:top w:type="dxa" w:w="100"/>
+              <w:left w:type="dxa" w:w="120"/>
+              <w:bottom w:type="dxa" w:w="100"/>
+              <w:right w:type="dxa" w:w="120"/>
+            </w:tcMar>
+            <w:vAlign w:val="center"/>
+          </w:tcPr>
+          <w:p>
+            <w:pPr>
+              <w:jc w:val="left"/>
+            </w:pPr>
+            <w:r>
+              <w:rPr>
+                <w:b w:val="false"/>
+                <w:bCs w:val="false"/>
+                <w:i w:val="false"/>
+                <w:iCs w:val="false"/>
+                <w:color w:val="4A6A8A"/>
+                <w:sz w:val="19"/>
+                <w:szCs w:val="19"/>
+              </w:rPr>
+              <w:t xml:space="preserve">Sigla</w:t>
+            </w:r>
+          </w:p>
+        </w:tc>
+        <w:tc>
+          <w:tcPr>
+            <w:tcW w:type="dxa" w:w="5760"/>
+            <w:tcBorders>
+              <w:top w:val="single" w:color="CCCCCC" w:sz="4"/>
+              <w:left w:val="single" w:color="CCCCCC" w:sz="4"/>
+              <w:bottom w:val="single" w:color="CCCCCC" w:sz="4"/>
+              <w:right w:val="single" w:color="CCCCCC" w:sz="4"/>
+            </w:tcBorders>
+            <w:tcMar>
+              <w:top w:type="dxa" w:w="100"/>
+              <w:left w:type="dxa" w:w="120"/>
+              <w:bottom w:type="dxa" w:w="100"/>
+              <w:right w:type="dxa" w:w="120"/>
+            </w:tcMar>
+            <w:vAlign w:val="center"/>
+          </w:tcPr>
+          <w:p>
+            <w:pPr>
+              <w:jc w:val="left"/>
+            </w:pPr>
+            <w:r>
+              <w:rPr>
+                <w:b w:val="false"/>
+                <w:bCs w:val="false"/>
+                <w:i w:val="false"/>
+                <w:iCs w:val="false"/>
+                <w:sz w:val="19"/>
+                <w:szCs w:val="19"/>
+              </w:rPr>
+              <w:t xml:space="preserve">Fault, Configuration, Accounting, Performance, Security — enquadramento conceitual da camada de assurance, junto com ITU-T M.3400.</w:t>
+            </w:r>
+          </w:p>
+        </w:tc>
+      </w:tr>
+      <w:tr>
+        <w:tc>
+          <w:tcPr>
+            <w:tcW w:type="dxa" w:w="2100"/>
+            <w:tcBorders>
+              <w:top w:val="single" w:color="CCCCCC" w:sz="4"/>
+              <w:left w:val="single" w:color="CCCCCC" w:sz="4"/>
+              <w:bottom w:val="single" w:color="CCCCCC" w:sz="4"/>
+              <w:right w:val="single" w:color="CCCCCC" w:sz="4"/>
+            </w:tcBorders>
+            <w:tcMar>
+              <w:top w:type="dxa" w:w="100"/>
+              <w:left w:type="dxa" w:w="120"/>
+              <w:bottom w:type="dxa" w:w="100"/>
+              <w:right w:type="dxa" w:w="120"/>
+            </w:tcMar>
+            <w:vAlign w:val="center"/>
+          </w:tcPr>
+          <w:p>
+            <w:pPr>
+              <w:jc w:val="left"/>
+            </w:pPr>
+            <w:r>
+              <w:rPr>
+                <w:b/>
+                <w:bCs/>
+                <w:i w:val="false"/>
+                <w:iCs w:val="false"/>
+                <w:sz w:val="19"/>
+                <w:szCs w:val="19"/>
+              </w:rPr>
+              <w:t xml:space="preserve">ITU-T M.3400</w:t>
+            </w:r>
+          </w:p>
+        </w:tc>
+        <w:tc>
+          <w:tcPr>
+            <w:tcW w:type="dxa" w:w="1500"/>
+            <w:tcBorders>
+              <w:top w:val="single" w:color="CCCCCC" w:sz="4"/>
+              <w:left w:val="single" w:color="CCCCCC" w:sz="4"/>
+              <w:bottom w:val="single" w:color="CCCCCC" w:sz="4"/>
+              <w:right w:val="single" w:color="CCCCCC" w:sz="4"/>
+            </w:tcBorders>
+            <w:tcMar>
+              <w:top w:type="dxa" w:w="100"/>
+              <w:left w:type="dxa" w:w="120"/>
+              <w:bottom w:type="dxa" w:w="100"/>
+              <w:right w:type="dxa" w:w="120"/>
+            </w:tcMar>
+            <w:vAlign w:val="center"/>
+          </w:tcPr>
+          <w:p>
+            <w:pPr>
+              <w:jc w:val="left"/>
+            </w:pPr>
+            <w:r>
+              <w:rPr>
+                <w:b w:val="false"/>
+                <w:bCs w:val="false"/>
+                <w:i w:val="false"/>
+                <w:iCs w:val="false"/>
+                <w:color w:val="4A6A8A"/>
+                <w:sz w:val="19"/>
+                <w:szCs w:val="19"/>
+              </w:rPr>
+              <w:t xml:space="preserve">Norma/Framework</w:t>
+            </w:r>
+          </w:p>
+        </w:tc>
+        <w:tc>
+          <w:tcPr>
+            <w:tcW w:type="dxa" w:w="5760"/>
+            <w:tcBorders>
+              <w:top w:val="single" w:color="CCCCCC" w:sz="4"/>
+              <w:left w:val="single" w:color="CCCCCC" w:sz="4"/>
+              <w:bottom w:val="single" w:color="CCCCCC" w:sz="4"/>
+              <w:right w:val="single" w:color="CCCCCC" w:sz="4"/>
+            </w:tcBorders>
+            <w:tcMar>
+              <w:top w:type="dxa" w:w="100"/>
+              <w:left w:type="dxa" w:w="120"/>
+              <w:bottom w:type="dxa" w:w="100"/>
+              <w:right w:type="dxa" w:w="120"/>
+            </w:tcMar>
+            <w:vAlign w:val="center"/>
+          </w:tcPr>
+          <w:p>
+            <w:pPr>
+              <w:jc w:val="left"/>
+            </w:pPr>
+            <w:r>
+              <w:rPr>
+                <w:b w:val="false"/>
+                <w:bCs w:val="false"/>
+                <w:i w:val="false"/>
+                <w:iCs w:val="false"/>
+                <w:sz w:val="19"/>
+                <w:szCs w:val="19"/>
+              </w:rPr>
+              <w:t xml:space="preserve">Recommendation M.3400 — funções de gerenciamento TMN, com foco em Fault Management.</w:t>
+            </w:r>
+          </w:p>
+        </w:tc>
+      </w:tr>
+      <w:tr>
+        <w:tc>
+          <w:tcPr>
+            <w:tcW w:type="dxa" w:w="2100"/>
+            <w:tcBorders>
+              <w:top w:val="single" w:color="CCCCCC" w:sz="4"/>
+              <w:left w:val="single" w:color="CCCCCC" w:sz="4"/>
+              <w:bottom w:val="single" w:color="CCCCCC" w:sz="4"/>
+              <w:right w:val="single" w:color="CCCCCC" w:sz="4"/>
+            </w:tcBorders>
+            <w:tcMar>
+              <w:top w:type="dxa" w:w="100"/>
+              <w:left w:type="dxa" w:w="120"/>
+              <w:bottom w:type="dxa" w:w="100"/>
+              <w:right w:type="dxa" w:w="120"/>
+            </w:tcMar>
+            <w:vAlign w:val="center"/>
+          </w:tcPr>
+          <w:p>
+            <w:pPr>
+              <w:jc w:val="left"/>
+            </w:pPr>
+            <w:r>
+              <w:rPr>
+                <w:b/>
+                <w:bCs/>
+                <w:i w:val="false"/>
+                <w:iCs w:val="false"/>
+                <w:sz w:val="19"/>
+                <w:szCs w:val="19"/>
+              </w:rPr>
+              <w:t xml:space="preserve">LGPD</w:t>
+            </w:r>
+          </w:p>
+        </w:tc>
+        <w:tc>
+          <w:tcPr>
+            <w:tcW w:type="dxa" w:w="1500"/>
+            <w:tcBorders>
+              <w:top w:val="single" w:color="CCCCCC" w:sz="4"/>
+              <w:left w:val="single" w:color="CCCCCC" w:sz="4"/>
+              <w:bottom w:val="single" w:color="CCCCCC" w:sz="4"/>
+              <w:right w:val="single" w:color="CCCCCC" w:sz="4"/>
+            </w:tcBorders>
+            <w:tcMar>
+              <w:top w:type="dxa" w:w="100"/>
+              <w:left w:type="dxa" w:w="120"/>
+              <w:bottom w:type="dxa" w:w="100"/>
+              <w:right w:type="dxa" w:w="120"/>
+            </w:tcMar>
+            <w:vAlign w:val="center"/>
+          </w:tcPr>
+          <w:p>
+            <w:pPr>
+              <w:jc w:val="left"/>
+            </w:pPr>
+            <w:r>
+              <w:rPr>
+                <w:b w:val="false"/>
+                <w:bCs w:val="false"/>
+                <w:i w:val="false"/>
+                <w:iCs w:val="false"/>
+                <w:color w:val="4A6A8A"/>
+                <w:sz w:val="19"/>
+                <w:szCs w:val="19"/>
+              </w:rPr>
+              <w:t xml:space="preserve">Sigla</w:t>
+            </w:r>
+          </w:p>
+        </w:tc>
+        <w:tc>
+          <w:tcPr>
+            <w:tcW w:type="dxa" w:w="5760"/>
+            <w:tcBorders>
+              <w:top w:val="single" w:color="CCCCCC" w:sz="4"/>
+              <w:left w:val="single" w:color="CCCCCC" w:sz="4"/>
+              <w:bottom w:val="single" w:color="CCCCCC" w:sz="4"/>
+              <w:right w:val="single" w:color="CCCCCC" w:sz="4"/>
+            </w:tcBorders>
+            <w:tcMar>
+              <w:top w:type="dxa" w:w="100"/>
+              <w:left w:type="dxa" w:w="120"/>
+              <w:bottom w:type="dxa" w:w="100"/>
+              <w:right w:type="dxa" w:w="120"/>
+            </w:tcMar>
+            <w:vAlign w:val="center"/>
+          </w:tcPr>
+          <w:p>
+            <w:pPr>
+              <w:jc w:val="left"/>
+            </w:pPr>
+            <w:r>
+              <w:rPr>
+                <w:b w:val="false"/>
+                <w:bCs w:val="false"/>
+                <w:i w:val="false"/>
+                <w:iCs w:val="false"/>
+                <w:sz w:val="19"/>
+                <w:szCs w:val="19"/>
+              </w:rPr>
+              <w:t xml:space="preserve">Lei Geral de Proteção de Dados (Lei nº 13.709/2018); base legal da Consulta Individual de Elemento de Rede quando desce a nível de assinante.</w:t>
+            </w:r>
+          </w:p>
+        </w:tc>
+      </w:tr>
+      <w:tr>
+        <w:tc>
+          <w:tcPr>
+            <w:tcW w:type="dxa" w:w="2100"/>
+            <w:tcBorders>
+              <w:top w:val="single" w:color="CCCCCC" w:sz="4"/>
+              <w:left w:val="single" w:color="CCCCCC" w:sz="4"/>
+              <w:bottom w:val="single" w:color="CCCCCC" w:sz="4"/>
+              <w:right w:val="single" w:color="CCCCCC" w:sz="4"/>
+            </w:tcBorders>
+            <w:tcMar>
+              <w:top w:type="dxa" w:w="100"/>
+              <w:left w:type="dxa" w:w="120"/>
+              <w:bottom w:type="dxa" w:w="100"/>
+              <w:right w:type="dxa" w:w="120"/>
+            </w:tcMar>
+            <w:vAlign w:val="center"/>
+          </w:tcPr>
+          <w:p>
+            <w:pPr>
+              <w:jc w:val="left"/>
+            </w:pPr>
+            <w:r>
+              <w:rPr>
+                <w:b/>
+                <w:bCs/>
+                <w:i w:val="false"/>
+                <w:iCs w:val="false"/>
+                <w:sz w:val="19"/>
+                <w:szCs w:val="19"/>
+              </w:rPr>
+              <w:t xml:space="preserve">MAD</w:t>
+            </w:r>
+          </w:p>
+        </w:tc>
+        <w:tc>
+          <w:tcPr>
+            <w:tcW w:type="dxa" w:w="1500"/>
+            <w:tcBorders>
+              <w:top w:val="single" w:color="CCCCCC" w:sz="4"/>
+              <w:left w:val="single" w:color="CCCCCC" w:sz="4"/>
+              <w:bottom w:val="single" w:color="CCCCCC" w:sz="4"/>
+              <w:right w:val="single" w:color="CCCCCC" w:sz="4"/>
+            </w:tcBorders>
+            <w:tcMar>
+              <w:top w:type="dxa" w:w="100"/>
+              <w:left w:type="dxa" w:w="120"/>
+              <w:bottom w:type="dxa" w:w="100"/>
+              <w:right w:type="dxa" w:w="120"/>
+            </w:tcMar>
+            <w:vAlign w:val="center"/>
+          </w:tcPr>
+          <w:p>
+            <w:pPr>
+              <w:jc w:val="left"/>
+            </w:pPr>
+            <w:r>
+              <w:rPr>
+                <w:b w:val="false"/>
+                <w:bCs w:val="false"/>
+                <w:i w:val="false"/>
+                <w:iCs w:val="false"/>
+                <w:color w:val="4A6A8A"/>
+                <w:sz w:val="19"/>
+                <w:szCs w:val="19"/>
+              </w:rPr>
+              <w:t xml:space="preserve">Modelo/Técnica</w:t>
+            </w:r>
+          </w:p>
+        </w:tc>
+        <w:tc>
+          <w:tcPr>
+            <w:tcW w:type="dxa" w:w="5760"/>
+            <w:tcBorders>
+              <w:top w:val="single" w:color="CCCCCC" w:sz="4"/>
+              <w:left w:val="single" w:color="CCCCCC" w:sz="4"/>
+              <w:bottom w:val="single" w:color="CCCCCC" w:sz="4"/>
+              <w:right w:val="single" w:color="CCCCCC" w:sz="4"/>
+            </w:tcBorders>
+            <w:tcMar>
+              <w:top w:type="dxa" w:w="100"/>
+              <w:left w:type="dxa" w:w="120"/>
+              <w:bottom w:type="dxa" w:w="100"/>
+              <w:right w:type="dxa" w:w="120"/>
+            </w:tcMar>
+            <w:vAlign w:val="center"/>
+          </w:tcPr>
+          <w:p>
+            <w:pPr>
+              <w:jc w:val="left"/>
+            </w:pPr>
+            <w:r>
+              <w:rPr>
+                <w:b w:val="false"/>
+                <w:bCs w:val="false"/>
+                <w:i w:val="false"/>
+                <w:iCs w:val="false"/>
+                <w:sz w:val="19"/>
+                <w:szCs w:val="19"/>
+              </w:rPr>
+              <w:t xml:space="preserve">Median Absolute Deviation — detector de outlier por z-score robusto, aplicado a latência, perda de pacote e utilização por nó.</w:t>
+            </w:r>
+          </w:p>
+        </w:tc>
+      </w:tr>
+      <w:tr>
+        <w:tc>
+          <w:tcPr>
+            <w:tcW w:type="dxa" w:w="2100"/>
+            <w:tcBorders>
+              <w:top w:val="single" w:color="CCCCCC" w:sz="4"/>
+              <w:left w:val="single" w:color="CCCCCC" w:sz="4"/>
+              <w:bottom w:val="single" w:color="CCCCCC" w:sz="4"/>
+              <w:right w:val="single" w:color="CCCCCC" w:sz="4"/>
+            </w:tcBorders>
+            <w:tcMar>
+              <w:top w:type="dxa" w:w="100"/>
+              <w:left w:type="dxa" w:w="120"/>
+              <w:bottom w:type="dxa" w:w="100"/>
+              <w:right w:type="dxa" w:w="120"/>
+            </w:tcMar>
+            <w:vAlign w:val="center"/>
+          </w:tcPr>
+          <w:p>
+            <w:pPr>
+              <w:jc w:val="left"/>
+            </w:pPr>
+            <w:r>
+              <w:rPr>
+                <w:b/>
+                <w:bCs/>
+                <w:i w:val="false"/>
+                <w:iCs w:val="false"/>
+                <w:sz w:val="19"/>
+                <w:szCs w:val="19"/>
+              </w:rPr>
+              <w:t xml:space="preserve">Markov (Cadeia de Markov)</w:t>
+            </w:r>
+          </w:p>
+        </w:tc>
+        <w:tc>
+          <w:tcPr>
+            <w:tcW w:type="dxa" w:w="1500"/>
+            <w:tcBorders>
+              <w:top w:val="single" w:color="CCCCCC" w:sz="4"/>
+              <w:left w:val="single" w:color="CCCCCC" w:sz="4"/>
+              <w:bottom w:val="single" w:color="CCCCCC" w:sz="4"/>
+              <w:right w:val="single" w:color="CCCCCC" w:sz="4"/>
+            </w:tcBorders>
+            <w:tcMar>
+              <w:top w:type="dxa" w:w="100"/>
+              <w:left w:type="dxa" w:w="120"/>
+              <w:bottom w:type="dxa" w:w="100"/>
+              <w:right w:type="dxa" w:w="120"/>
+            </w:tcMar>
+            <w:vAlign w:val="center"/>
+          </w:tcPr>
+          <w:p>
+            <w:pPr>
+              <w:jc w:val="left"/>
+            </w:pPr>
+            <w:r>
+              <w:rPr>
+                <w:b w:val="false"/>
+                <w:bCs w:val="false"/>
+                <w:i w:val="false"/>
+                <w:iCs w:val="false"/>
+                <w:color w:val="4A6A8A"/>
+                <w:sz w:val="19"/>
+                <w:szCs w:val="19"/>
+              </w:rPr>
+              <w:t xml:space="preserve">Modelo/Técnica</w:t>
+            </w:r>
+          </w:p>
+        </w:tc>
+        <w:tc>
+          <w:tcPr>
+            <w:tcW w:type="dxa" w:w="5760"/>
+            <w:tcBorders>
+              <w:top w:val="single" w:color="CCCCCC" w:sz="4"/>
+              <w:left w:val="single" w:color="CCCCCC" w:sz="4"/>
+              <w:bottom w:val="single" w:color="CCCCCC" w:sz="4"/>
+              <w:right w:val="single" w:color="CCCCCC" w:sz="4"/>
+            </w:tcBorders>
+            <w:tcMar>
+              <w:top w:type="dxa" w:w="100"/>
+              <w:left w:type="dxa" w:w="120"/>
+              <w:bottom w:type="dxa" w:w="100"/>
+              <w:right w:type="dxa" w:w="120"/>
+            </w:tcMar>
+            <w:vAlign w:val="center"/>
+          </w:tcPr>
+          <w:p>
+            <w:pPr>
+              <w:jc w:val="left"/>
+            </w:pPr>
+            <w:r>
+              <w:rPr>
+                <w:b w:val="false"/>
+                <w:bCs w:val="false"/>
+                <w:i w:val="false"/>
+                <w:iCs w:val="false"/>
+                <w:sz w:val="19"/>
+                <w:szCs w:val="19"/>
+              </w:rPr>
+              <w:t xml:space="preserve">Estados Saudável→Degradado→Crítico→Falha(+Recuperado); matriz de transição estimada por contagem real de transições observadas na série sintética de cada classe de nó.</w:t>
+            </w:r>
+          </w:p>
+        </w:tc>
+      </w:tr>
+      <w:tr>
+        <w:tc>
+          <w:tcPr>
+            <w:tcW w:type="dxa" w:w="2100"/>
+            <w:tcBorders>
+              <w:top w:val="single" w:color="CCCCCC" w:sz="4"/>
+              <w:left w:val="single" w:color="CCCCCC" w:sz="4"/>
+              <w:bottom w:val="single" w:color="CCCCCC" w:sz="4"/>
+              <w:right w:val="single" w:color="CCCCCC" w:sz="4"/>
+            </w:tcBorders>
+            <w:tcMar>
+              <w:top w:type="dxa" w:w="100"/>
+              <w:left w:type="dxa" w:w="120"/>
+              <w:bottom w:type="dxa" w:w="100"/>
+              <w:right w:type="dxa" w:w="120"/>
+            </w:tcMar>
+            <w:vAlign w:val="center"/>
+          </w:tcPr>
+          <w:p>
+            <w:pPr>
+              <w:jc w:val="left"/>
+            </w:pPr>
+            <w:r>
+              <w:rPr>
+                <w:b/>
+                <w:bCs/>
+                <w:i w:val="false"/>
+                <w:iCs w:val="false"/>
+                <w:sz w:val="19"/>
+                <w:szCs w:val="19"/>
+              </w:rPr>
+              <w:t xml:space="preserve">OLT</w:t>
+            </w:r>
+          </w:p>
+        </w:tc>
+        <w:tc>
+          <w:tcPr>
+            <w:tcW w:type="dxa" w:w="1500"/>
+            <w:tcBorders>
+              <w:top w:val="single" w:color="CCCCCC" w:sz="4"/>
+              <w:left w:val="single" w:color="CCCCCC" w:sz="4"/>
+              <w:bottom w:val="single" w:color="CCCCCC" w:sz="4"/>
+              <w:right w:val="single" w:color="CCCCCC" w:sz="4"/>
+            </w:tcBorders>
+            <w:tcMar>
+              <w:top w:type="dxa" w:w="100"/>
+              <w:left w:type="dxa" w:w="120"/>
+              <w:bottom w:type="dxa" w:w="100"/>
+              <w:right w:type="dxa" w:w="120"/>
+            </w:tcMar>
+            <w:vAlign w:val="center"/>
+          </w:tcPr>
+          <w:p>
+            <w:pPr>
+              <w:jc w:val="left"/>
+            </w:pPr>
+            <w:r>
+              <w:rPr>
+                <w:b w:val="false"/>
+                <w:bCs w:val="false"/>
+                <w:i w:val="false"/>
+                <w:iCs w:val="false"/>
+                <w:color w:val="4A6A8A"/>
+                <w:sz w:val="19"/>
+                <w:szCs w:val="19"/>
+              </w:rPr>
+              <w:t xml:space="preserve">Sigla</w:t>
+            </w:r>
+          </w:p>
+        </w:tc>
+        <w:tc>
+          <w:tcPr>
+            <w:tcW w:type="dxa" w:w="5760"/>
+            <w:tcBorders>
+              <w:top w:val="single" w:color="CCCCCC" w:sz="4"/>
+              <w:left w:val="single" w:color="CCCCCC" w:sz="4"/>
+              <w:bottom w:val="single" w:color="CCCCCC" w:sz="4"/>
+              <w:right w:val="single" w:color="CCCCCC" w:sz="4"/>
+            </w:tcBorders>
+            <w:tcMar>
+              <w:top w:type="dxa" w:w="100"/>
+              <w:left w:type="dxa" w:w="120"/>
+              <w:bottom w:type="dxa" w:w="100"/>
+              <w:right w:type="dxa" w:w="120"/>
+            </w:tcMar>
+            <w:vAlign w:val="center"/>
+          </w:tcPr>
+          <w:p>
+            <w:pPr>
+              <w:jc w:val="left"/>
+            </w:pPr>
+            <w:r>
+              <w:rPr>
+                <w:b w:val="false"/>
+                <w:bCs w:val="false"/>
+                <w:i w:val="false"/>
+                <w:iCs w:val="false"/>
+                <w:sz w:val="19"/>
+                <w:szCs w:val="19"/>
+              </w:rPr>
+              <w:t xml:space="preserve">Optical Line Terminal — nível hierárquico entre POP e PON/Splitter (2–4 por POP, capacidade 2.500–10.000 Mbps).</w:t>
+            </w:r>
+          </w:p>
+        </w:tc>
+      </w:tr>
+      <w:tr>
+        <w:tc>
+          <w:tcPr>
+            <w:tcW w:type="dxa" w:w="2100"/>
+            <w:tcBorders>
+              <w:top w:val="single" w:color="CCCCCC" w:sz="4"/>
+              <w:left w:val="single" w:color="CCCCCC" w:sz="4"/>
+              <w:bottom w:val="single" w:color="CCCCCC" w:sz="4"/>
+              <w:right w:val="single" w:color="CCCCCC" w:sz="4"/>
+            </w:tcBorders>
+            <w:tcMar>
+              <w:top w:type="dxa" w:w="100"/>
+              <w:left w:type="dxa" w:w="120"/>
+              <w:bottom w:type="dxa" w:w="100"/>
+              <w:right w:type="dxa" w:w="120"/>
+            </w:tcMar>
+            <w:vAlign w:val="center"/>
+          </w:tcPr>
+          <w:p>
+            <w:pPr>
+              <w:jc w:val="left"/>
+            </w:pPr>
+            <w:r>
+              <w:rPr>
+                <w:b/>
+                <w:bCs/>
+                <w:i w:val="false"/>
+                <w:iCs w:val="false"/>
+                <w:sz w:val="19"/>
+                <w:szCs w:val="19"/>
+              </w:rPr>
+              <w:t xml:space="preserve">ONT</w:t>
+            </w:r>
+          </w:p>
+        </w:tc>
+        <w:tc>
+          <w:tcPr>
+            <w:tcW w:type="dxa" w:w="1500"/>
+            <w:tcBorders>
+              <w:top w:val="single" w:color="CCCCCC" w:sz="4"/>
+              <w:left w:val="single" w:color="CCCCCC" w:sz="4"/>
+              <w:bottom w:val="single" w:color="CCCCCC" w:sz="4"/>
+              <w:right w:val="single" w:color="CCCCCC" w:sz="4"/>
+            </w:tcBorders>
+            <w:tcMar>
+              <w:top w:type="dxa" w:w="100"/>
+              <w:left w:type="dxa" w:w="120"/>
+              <w:bottom w:type="dxa" w:w="100"/>
+              <w:right w:type="dxa" w:w="120"/>
+            </w:tcMar>
+            <w:vAlign w:val="center"/>
+          </w:tcPr>
+          <w:p>
+            <w:pPr>
+              <w:jc w:val="left"/>
+            </w:pPr>
+            <w:r>
+              <w:rPr>
+                <w:b w:val="false"/>
+                <w:bCs w:val="false"/>
+                <w:i w:val="false"/>
+                <w:iCs w:val="false"/>
+                <w:color w:val="4A6A8A"/>
+                <w:sz w:val="19"/>
+                <w:szCs w:val="19"/>
+              </w:rPr>
+              <w:t xml:space="preserve">Sigla</w:t>
+            </w:r>
+          </w:p>
+        </w:tc>
+        <w:tc>
+          <w:tcPr>
+            <w:tcW w:type="dxa" w:w="5760"/>
+            <w:tcBorders>
+              <w:top w:val="single" w:color="CCCCCC" w:sz="4"/>
+              <w:left w:val="single" w:color="CCCCCC" w:sz="4"/>
+              <w:bottom w:val="single" w:color="CCCCCC" w:sz="4"/>
+              <w:right w:val="single" w:color="CCCCCC" w:sz="4"/>
+            </w:tcBorders>
+            <w:tcMar>
+              <w:top w:type="dxa" w:w="100"/>
+              <w:left w:type="dxa" w:w="120"/>
+              <w:bottom w:type="dxa" w:w="100"/>
+              <w:right w:type="dxa" w:w="120"/>
+            </w:tcMar>
+            <w:vAlign w:val="center"/>
+          </w:tcPr>
+          <w:p>
+            <w:pPr>
+              <w:jc w:val="left"/>
+            </w:pPr>
+            <w:r>
+              <w:rPr>
+                <w:b w:val="false"/>
+                <w:bCs w:val="false"/>
+                <w:i w:val="false"/>
+                <w:iCs w:val="false"/>
+                <w:sz w:val="19"/>
+                <w:szCs w:val="19"/>
+              </w:rPr>
+              <w:t xml:space="preserve">Optical Network Terminal — elemento de rede no nível do assinante; individualizado apenas na Consulta Individual restrita.</w:t>
+            </w:r>
+          </w:p>
+        </w:tc>
+      </w:tr>
+      <w:tr>
+        <w:tc>
+          <w:tcPr>
+            <w:tcW w:type="dxa" w:w="2100"/>
+            <w:tcBorders>
+              <w:top w:val="single" w:color="CCCCCC" w:sz="4"/>
+              <w:left w:val="single" w:color="CCCCCC" w:sz="4"/>
+              <w:bottom w:val="single" w:color="CCCCCC" w:sz="4"/>
+              <w:right w:val="single" w:color="CCCCCC" w:sz="4"/>
+            </w:tcBorders>
+            <w:tcMar>
+              <w:top w:type="dxa" w:w="100"/>
+              <w:left w:type="dxa" w:w="120"/>
+              <w:bottom w:type="dxa" w:w="100"/>
+              <w:right w:type="dxa" w:w="120"/>
+            </w:tcMar>
+            <w:vAlign w:val="center"/>
+          </w:tcPr>
+          <w:p>
+            <w:pPr>
+              <w:jc w:val="left"/>
+            </w:pPr>
+            <w:r>
+              <w:rPr>
+                <w:b/>
+                <w:bCs/>
+                <w:i w:val="false"/>
+                <w:iCs w:val="false"/>
+                <w:sz w:val="19"/>
+                <w:szCs w:val="19"/>
+              </w:rPr>
+              <w:t xml:space="preserve">PON</w:t>
+            </w:r>
+          </w:p>
+        </w:tc>
+        <w:tc>
+          <w:tcPr>
+            <w:tcW w:type="dxa" w:w="1500"/>
+            <w:tcBorders>
+              <w:top w:val="single" w:color="CCCCCC" w:sz="4"/>
+              <w:left w:val="single" w:color="CCCCCC" w:sz="4"/>
+              <w:bottom w:val="single" w:color="CCCCCC" w:sz="4"/>
+              <w:right w:val="single" w:color="CCCCCC" w:sz="4"/>
+            </w:tcBorders>
+            <w:tcMar>
+              <w:top w:type="dxa" w:w="100"/>
+              <w:left w:type="dxa" w:w="120"/>
+              <w:bottom w:type="dxa" w:w="100"/>
+              <w:right w:type="dxa" w:w="120"/>
+            </w:tcMar>
+            <w:vAlign w:val="center"/>
+          </w:tcPr>
+          <w:p>
+            <w:pPr>
+              <w:jc w:val="left"/>
+            </w:pPr>
+            <w:r>
+              <w:rPr>
+                <w:b w:val="false"/>
+                <w:bCs w:val="false"/>
+                <w:i w:val="false"/>
+                <w:iCs w:val="false"/>
+                <w:color w:val="4A6A8A"/>
+                <w:sz w:val="19"/>
+                <w:szCs w:val="19"/>
+              </w:rPr>
+              <w:t xml:space="preserve">Sigla</w:t>
+            </w:r>
+          </w:p>
+        </w:tc>
+        <w:tc>
+          <w:tcPr>
+            <w:tcW w:type="dxa" w:w="5760"/>
+            <w:tcBorders>
+              <w:top w:val="single" w:color="CCCCCC" w:sz="4"/>
+              <w:left w:val="single" w:color="CCCCCC" w:sz="4"/>
+              <w:bottom w:val="single" w:color="CCCCCC" w:sz="4"/>
+              <w:right w:val="single" w:color="CCCCCC" w:sz="4"/>
+            </w:tcBorders>
+            <w:tcMar>
+              <w:top w:type="dxa" w:w="100"/>
+              <w:left w:type="dxa" w:w="120"/>
+              <w:bottom w:type="dxa" w:w="100"/>
+              <w:right w:type="dxa" w:w="120"/>
+            </w:tcMar>
+            <w:vAlign w:val="center"/>
+          </w:tcPr>
+          <w:p>
+            <w:pPr>
+              <w:jc w:val="left"/>
+            </w:pPr>
+            <w:r>
+              <w:rPr>
+                <w:b w:val="false"/>
+                <w:bCs w:val="false"/>
+                <w:i w:val="false"/>
+                <w:iCs w:val="false"/>
+                <w:sz w:val="19"/>
+                <w:szCs w:val="19"/>
+              </w:rPr>
+              <w:t xml:space="preserve">Passive Optical Network — nível hierárquico entre OLT e CTO (2–4 por OLT, splitter de 16/32/64 portas).</w:t>
+            </w:r>
+          </w:p>
+        </w:tc>
+      </w:tr>
+      <w:tr>
+        <w:tc>
+          <w:tcPr>
+            <w:tcW w:type="dxa" w:w="2100"/>
+            <w:tcBorders>
+              <w:top w:val="single" w:color="CCCCCC" w:sz="4"/>
+              <w:left w:val="single" w:color="CCCCCC" w:sz="4"/>
+              <w:bottom w:val="single" w:color="CCCCCC" w:sz="4"/>
+              <w:right w:val="single" w:color="CCCCCC" w:sz="4"/>
+            </w:tcBorders>
+            <w:tcMar>
+              <w:top w:type="dxa" w:w="100"/>
+              <w:left w:type="dxa" w:w="120"/>
+              <w:bottom w:type="dxa" w:w="100"/>
+              <w:right w:type="dxa" w:w="120"/>
+            </w:tcMar>
+            <w:vAlign w:val="center"/>
+          </w:tcPr>
+          <w:p>
+            <w:pPr>
+              <w:jc w:val="left"/>
+            </w:pPr>
+            <w:r>
+              <w:rPr>
+                <w:b/>
+                <w:bCs/>
+                <w:i w:val="false"/>
+                <w:iCs w:val="false"/>
+                <w:sz w:val="19"/>
+                <w:szCs w:val="19"/>
+              </w:rPr>
+              <w:t xml:space="preserve">POP</w:t>
+            </w:r>
+          </w:p>
+        </w:tc>
+        <w:tc>
+          <w:tcPr>
+            <w:tcW w:type="dxa" w:w="1500"/>
+            <w:tcBorders>
+              <w:top w:val="single" w:color="CCCCCC" w:sz="4"/>
+              <w:left w:val="single" w:color="CCCCCC" w:sz="4"/>
+              <w:bottom w:val="single" w:color="CCCCCC" w:sz="4"/>
+              <w:right w:val="single" w:color="CCCCCC" w:sz="4"/>
+            </w:tcBorders>
+            <w:tcMar>
+              <w:top w:type="dxa" w:w="100"/>
+              <w:left w:type="dxa" w:w="120"/>
+              <w:bottom w:type="dxa" w:w="100"/>
+              <w:right w:type="dxa" w:w="120"/>
+            </w:tcMar>
+            <w:vAlign w:val="center"/>
+          </w:tcPr>
+          <w:p>
+            <w:pPr>
+              <w:jc w:val="left"/>
+            </w:pPr>
+            <w:r>
+              <w:rPr>
+                <w:b w:val="false"/>
+                <w:bCs w:val="false"/>
+                <w:i w:val="false"/>
+                <w:iCs w:val="false"/>
+                <w:color w:val="4A6A8A"/>
+                <w:sz w:val="19"/>
+                <w:szCs w:val="19"/>
+              </w:rPr>
+              <w:t xml:space="preserve">Sigla</w:t>
+            </w:r>
+          </w:p>
+        </w:tc>
+        <w:tc>
+          <w:tcPr>
+            <w:tcW w:type="dxa" w:w="5760"/>
+            <w:tcBorders>
+              <w:top w:val="single" w:color="CCCCCC" w:sz="4"/>
+              <w:left w:val="single" w:color="CCCCCC" w:sz="4"/>
+              <w:bottom w:val="single" w:color="CCCCCC" w:sz="4"/>
+              <w:right w:val="single" w:color="CCCCCC" w:sz="4"/>
+            </w:tcBorders>
+            <w:tcMar>
+              <w:top w:type="dxa" w:w="100"/>
+              <w:left w:type="dxa" w:w="120"/>
+              <w:bottom w:type="dxa" w:w="100"/>
+              <w:right w:type="dxa" w:w="120"/>
+            </w:tcMar>
+            <w:vAlign w:val="center"/>
+          </w:tcPr>
+          <w:p>
+            <w:pPr>
+              <w:jc w:val="left"/>
+            </w:pPr>
+            <w:r>
+              <w:rPr>
+                <w:b w:val="false"/>
+                <w:bCs w:val="false"/>
+                <w:i w:val="false"/>
+                <w:iCs w:val="false"/>
+                <w:sz w:val="19"/>
+                <w:szCs w:val="19"/>
+              </w:rPr>
+              <w:t xml:space="preserve">Point of Presence — nível hierárquico entre Backbone/Core e OLT (1 por zona, 8 no total; 3 dual-homed, os demais single-homed/SPOF).</w:t>
+            </w:r>
+          </w:p>
+        </w:tc>
+      </w:tr>
+      <w:tr>
+        <w:tc>
+          <w:tcPr>
+            <w:tcW w:type="dxa" w:w="2100"/>
+            <w:tcBorders>
+              <w:top w:val="single" w:color="CCCCCC" w:sz="4"/>
+              <w:left w:val="single" w:color="CCCCCC" w:sz="4"/>
+              <w:bottom w:val="single" w:color="CCCCCC" w:sz="4"/>
+              <w:right w:val="single" w:color="CCCCCC" w:sz="4"/>
+            </w:tcBorders>
+            <w:tcMar>
+              <w:top w:type="dxa" w:w="100"/>
+              <w:left w:type="dxa" w:w="120"/>
+              <w:bottom w:type="dxa" w:w="100"/>
+              <w:right w:type="dxa" w:w="120"/>
+            </w:tcMar>
+            <w:vAlign w:val="center"/>
+          </w:tcPr>
+          <w:p>
+            <w:pPr>
+              <w:jc w:val="left"/>
+            </w:pPr>
+            <w:r>
+              <w:rPr>
+                <w:b/>
+                <w:bCs/>
+                <w:i w:val="false"/>
+                <w:iCs w:val="false"/>
+                <w:sz w:val="19"/>
+                <w:szCs w:val="19"/>
+              </w:rPr>
+              <w:t xml:space="preserve">RAG / SLM</w:t>
+            </w:r>
+          </w:p>
+        </w:tc>
+        <w:tc>
+          <w:tcPr>
+            <w:tcW w:type="dxa" w:w="1500"/>
+            <w:tcBorders>
+              <w:top w:val="single" w:color="CCCCCC" w:sz="4"/>
+              <w:left w:val="single" w:color="CCCCCC" w:sz="4"/>
+              <w:bottom w:val="single" w:color="CCCCCC" w:sz="4"/>
+              <w:right w:val="single" w:color="CCCCCC" w:sz="4"/>
+            </w:tcBorders>
+            <w:tcMar>
+              <w:top w:type="dxa" w:w="100"/>
+              <w:left w:type="dxa" w:w="120"/>
+              <w:bottom w:type="dxa" w:w="100"/>
+              <w:right w:type="dxa" w:w="120"/>
+            </w:tcMar>
+            <w:vAlign w:val="center"/>
+          </w:tcPr>
+          <w:p>
+            <w:pPr>
+              <w:jc w:val="left"/>
+            </w:pPr>
+            <w:r>
+              <w:rPr>
+                <w:b w:val="false"/>
+                <w:bCs w:val="false"/>
+                <w:i w:val="false"/>
+                <w:iCs w:val="false"/>
+                <w:color w:val="4A6A8A"/>
+                <w:sz w:val="19"/>
+                <w:szCs w:val="19"/>
+              </w:rPr>
+              <w:t xml:space="preserve">Sigla</w:t>
+            </w:r>
+          </w:p>
+        </w:tc>
+        <w:tc>
+          <w:tcPr>
+            <w:tcW w:type="dxa" w:w="5760"/>
+            <w:tcBorders>
+              <w:top w:val="single" w:color="CCCCCC" w:sz="4"/>
+              <w:left w:val="single" w:color="CCCCCC" w:sz="4"/>
+              <w:bottom w:val="single" w:color="CCCCCC" w:sz="4"/>
+              <w:right w:val="single" w:color="CCCCCC" w:sz="4"/>
+            </w:tcBorders>
+            <w:tcMar>
+              <w:top w:type="dxa" w:w="100"/>
+              <w:left w:type="dxa" w:w="120"/>
+              <w:bottom w:type="dxa" w:w="100"/>
+              <w:right w:type="dxa" w:w="120"/>
+            </w:tcMar>
+            <w:vAlign w:val="center"/>
+          </w:tcPr>
+          <w:p>
+            <w:pPr>
+              <w:jc w:val="left"/>
+            </w:pPr>
+            <w:r>
+              <w:rPr>
+                <w:b w:val="false"/>
+                <w:bCs w:val="false"/>
+                <w:i w:val="false"/>
+                <w:iCs w:val="false"/>
+                <w:sz w:val="19"/>
+                <w:szCs w:val="19"/>
+              </w:rPr>
+              <w:t xml:space="preserve">Retrieval-Augmented Generation / Small Language Model — mesmo padrão mock do JourneyGraph: busca lexical sobre corpus estático, sem embeddings nem LLM real.</w:t>
+            </w:r>
+          </w:p>
+        </w:tc>
+      </w:tr>
+      <w:tr>
+        <w:tc>
+          <w:tcPr>
+            <w:tcW w:type="dxa" w:w="2100"/>
+            <w:tcBorders>
+              <w:top w:val="single" w:color="CCCCCC" w:sz="4"/>
+              <w:left w:val="single" w:color="CCCCCC" w:sz="4"/>
+              <w:bottom w:val="single" w:color="CCCCCC" w:sz="4"/>
+              <w:right w:val="single" w:color="CCCCCC" w:sz="4"/>
+            </w:tcBorders>
+            <w:tcMar>
+              <w:top w:type="dxa" w:w="100"/>
+              <w:left w:type="dxa" w:w="120"/>
+              <w:bottom w:type="dxa" w:w="100"/>
+              <w:right w:type="dxa" w:w="120"/>
+            </w:tcMar>
+            <w:vAlign w:val="center"/>
+          </w:tcPr>
+          <w:p>
+            <w:pPr>
+              <w:jc w:val="left"/>
+            </w:pPr>
+            <w:r>
+              <w:rPr>
+                <w:b/>
+                <w:bCs/>
+                <w:i w:val="false"/>
+                <w:iCs w:val="false"/>
+                <w:sz w:val="19"/>
+                <w:szCs w:val="19"/>
+              </w:rPr>
+              <w:t xml:space="preserve">Regressão Linear</w:t>
+            </w:r>
+          </w:p>
+        </w:tc>
+        <w:tc>
+          <w:tcPr>
+            <w:tcW w:type="dxa" w:w="1500"/>
+            <w:tcBorders>
+              <w:top w:val="single" w:color="CCCCCC" w:sz="4"/>
+              <w:left w:val="single" w:color="CCCCCC" w:sz="4"/>
+              <w:bottom w:val="single" w:color="CCCCCC" w:sz="4"/>
+              <w:right w:val="single" w:color="CCCCCC" w:sz="4"/>
+            </w:tcBorders>
+            <w:tcMar>
+              <w:top w:type="dxa" w:w="100"/>
+              <w:left w:type="dxa" w:w="120"/>
+              <w:bottom w:type="dxa" w:w="100"/>
+              <w:right w:type="dxa" w:w="120"/>
+            </w:tcMar>
+            <w:vAlign w:val="center"/>
+          </w:tcPr>
+          <w:p>
+            <w:pPr>
+              <w:jc w:val="left"/>
+            </w:pPr>
+            <w:r>
+              <w:rPr>
+                <w:b w:val="false"/>
+                <w:bCs w:val="false"/>
+                <w:i w:val="false"/>
+                <w:iCs w:val="false"/>
+                <w:color w:val="4A6A8A"/>
+                <w:sz w:val="19"/>
+                <w:szCs w:val="19"/>
+              </w:rPr>
+              <w:t xml:space="preserve">Modelo/Técnica</w:t>
+            </w:r>
+          </w:p>
+        </w:tc>
+        <w:tc>
+          <w:tcPr>
+            <w:tcW w:type="dxa" w:w="5760"/>
+            <w:tcBorders>
+              <w:top w:val="single" w:color="CCCCCC" w:sz="4"/>
+              <w:left w:val="single" w:color="CCCCCC" w:sz="4"/>
+              <w:bottom w:val="single" w:color="CCCCCC" w:sz="4"/>
+              <w:right w:val="single" w:color="CCCCCC" w:sz="4"/>
+            </w:tcBorders>
+            <w:tcMar>
+              <w:top w:type="dxa" w:w="100"/>
+              <w:left w:type="dxa" w:w="120"/>
+              <w:bottom w:type="dxa" w:w="100"/>
+              <w:right w:type="dxa" w:w="120"/>
+            </w:tcMar>
+            <w:vAlign w:val="center"/>
+          </w:tcPr>
+          <w:p>
+            <w:pPr>
+              <w:jc w:val="left"/>
+            </w:pPr>
+            <w:r>
+              <w:rPr>
+                <w:b w:val="false"/>
+                <w:bCs w:val="false"/>
+                <w:i w:val="false"/>
+                <w:iCs w:val="false"/>
+                <w:sz w:val="19"/>
+                <w:szCs w:val="19"/>
+              </w:rPr>
+              <w:t xml:space="preserve">Projeção de data de saturação (90–100% de utilização) por POP/OLT via regressão real sobre a série sintética, com intervalo de confiança.</w:t>
+            </w:r>
+          </w:p>
+        </w:tc>
+      </w:tr>
+      <w:tr>
+        <w:tc>
+          <w:tcPr>
+            <w:tcW w:type="dxa" w:w="2100"/>
+            <w:tcBorders>
+              <w:top w:val="single" w:color="CCCCCC" w:sz="4"/>
+              <w:left w:val="single" w:color="CCCCCC" w:sz="4"/>
+              <w:bottom w:val="single" w:color="CCCCCC" w:sz="4"/>
+              <w:right w:val="single" w:color="CCCCCC" w:sz="4"/>
+            </w:tcBorders>
+            <w:tcMar>
+              <w:top w:type="dxa" w:w="100"/>
+              <w:left w:type="dxa" w:w="120"/>
+              <w:bottom w:type="dxa" w:w="100"/>
+              <w:right w:type="dxa" w:w="120"/>
+            </w:tcMar>
+            <w:vAlign w:val="center"/>
+          </w:tcPr>
+          <w:p>
+            <w:pPr>
+              <w:jc w:val="left"/>
+            </w:pPr>
+            <w:r>
+              <w:rPr>
+                <w:b/>
+                <w:bCs/>
+                <w:i w:val="false"/>
+                <w:iCs w:val="false"/>
+                <w:sz w:val="19"/>
+                <w:szCs w:val="19"/>
+              </w:rPr>
+              <w:t xml:space="preserve">RQUAL</w:t>
+            </w:r>
+          </w:p>
+        </w:tc>
+        <w:tc>
+          <w:tcPr>
+            <w:tcW w:type="dxa" w:w="1500"/>
+            <w:tcBorders>
+              <w:top w:val="single" w:color="CCCCCC" w:sz="4"/>
+              <w:left w:val="single" w:color="CCCCCC" w:sz="4"/>
+              <w:bottom w:val="single" w:color="CCCCCC" w:sz="4"/>
+              <w:right w:val="single" w:color="CCCCCC" w:sz="4"/>
+            </w:tcBorders>
+            <w:tcMar>
+              <w:top w:type="dxa" w:w="100"/>
+              <w:left w:type="dxa" w:w="120"/>
+              <w:bottom w:type="dxa" w:w="100"/>
+              <w:right w:type="dxa" w:w="120"/>
+            </w:tcMar>
+            <w:vAlign w:val="center"/>
+          </w:tcPr>
+          <w:p>
+            <w:pPr>
+              <w:jc w:val="left"/>
+            </w:pPr>
+            <w:r>
+              <w:rPr>
+                <w:b w:val="false"/>
+                <w:bCs w:val="false"/>
+                <w:i w:val="false"/>
+                <w:iCs w:val="false"/>
+                <w:color w:val="4A6A8A"/>
+                <w:sz w:val="19"/>
+                <w:szCs w:val="19"/>
+              </w:rPr>
+              <w:t xml:space="preserve">Norma/Framework</w:t>
+            </w:r>
+          </w:p>
+        </w:tc>
+        <w:tc>
+          <w:tcPr>
+            <w:tcW w:type="dxa" w:w="5760"/>
+            <w:tcBorders>
+              <w:top w:val="single" w:color="CCCCCC" w:sz="4"/>
+              <w:left w:val="single" w:color="CCCCCC" w:sz="4"/>
+              <w:bottom w:val="single" w:color="CCCCCC" w:sz="4"/>
+              <w:right w:val="single" w:color="CCCCCC" w:sz="4"/>
+            </w:tcBorders>
+            <w:tcMar>
+              <w:top w:type="dxa" w:w="100"/>
+              <w:left w:type="dxa" w:w="120"/>
+              <w:bottom w:type="dxa" w:w="100"/>
+              <w:right w:type="dxa" w:w="120"/>
+            </w:tcMar>
+            <w:vAlign w:val="center"/>
+          </w:tcPr>
+          <w:p>
+            <w:pPr>
+              <w:jc w:val="left"/>
+            </w:pPr>
+            <w:r>
+              <w:rPr>
+                <w:b w:val="false"/>
+                <w:bCs w:val="false"/>
+                <w:i w:val="false"/>
+                <w:iCs w:val="false"/>
+                <w:sz w:val="19"/>
+                <w:szCs w:val="19"/>
+              </w:rPr>
+              <w:t xml:space="preserve">Regulamento de Qualidade dos Serviços de Telecomunicações (Anatel) — indicadores de qualidade, metas de disponibilidade e tempo de reparo, citados pelo Assistente.</w:t>
+            </w:r>
+          </w:p>
+        </w:tc>
+      </w:tr>
+      <w:tr>
+        <w:tc>
+          <w:tcPr>
+            <w:tcW w:type="dxa" w:w="2100"/>
+            <w:tcBorders>
+              <w:top w:val="single" w:color="CCCCCC" w:sz="4"/>
+              <w:left w:val="single" w:color="CCCCCC" w:sz="4"/>
+              <w:bottom w:val="single" w:color="CCCCCC" w:sz="4"/>
+              <w:right w:val="single" w:color="CCCCCC" w:sz="4"/>
+            </w:tcBorders>
+            <w:tcMar>
+              <w:top w:type="dxa" w:w="100"/>
+              <w:left w:type="dxa" w:w="120"/>
+              <w:bottom w:type="dxa" w:w="100"/>
+              <w:right w:type="dxa" w:w="120"/>
+            </w:tcMar>
+            <w:vAlign w:val="center"/>
+          </w:tcPr>
+          <w:p>
+            <w:pPr>
+              <w:jc w:val="left"/>
+            </w:pPr>
+            <w:r>
+              <w:rPr>
+                <w:b/>
+                <w:bCs/>
+                <w:i w:val="false"/>
+                <w:iCs w:val="false"/>
+                <w:sz w:val="19"/>
+                <w:szCs w:val="19"/>
+              </w:rPr>
+              <w:t xml:space="preserve">Selo Anatel</w:t>
+            </w:r>
+          </w:p>
+        </w:tc>
+        <w:tc>
+          <w:tcPr>
+            <w:tcW w:type="dxa" w:w="1500"/>
+            <w:tcBorders>
+              <w:top w:val="single" w:color="CCCCCC" w:sz="4"/>
+              <w:left w:val="single" w:color="CCCCCC" w:sz="4"/>
+              <w:bottom w:val="single" w:color="CCCCCC" w:sz="4"/>
+              <w:right w:val="single" w:color="CCCCCC" w:sz="4"/>
+            </w:tcBorders>
+            <w:tcMar>
+              <w:top w:type="dxa" w:w="100"/>
+              <w:left w:type="dxa" w:w="120"/>
+              <w:bottom w:type="dxa" w:w="100"/>
+              <w:right w:type="dxa" w:w="120"/>
+            </w:tcMar>
+            <w:vAlign w:val="center"/>
+          </w:tcPr>
+          <w:p>
+            <w:pPr>
+              <w:jc w:val="left"/>
+            </w:pPr>
+            <w:r>
+              <w:rPr>
+                <w:b w:val="false"/>
+                <w:bCs w:val="false"/>
+                <w:i w:val="false"/>
+                <w:iCs w:val="false"/>
+                <w:color w:val="4A6A8A"/>
+                <w:sz w:val="19"/>
+                <w:szCs w:val="19"/>
+              </w:rPr>
+              <w:t xml:space="preserve">Norma/Framework</w:t>
+            </w:r>
+          </w:p>
+        </w:tc>
+        <w:tc>
+          <w:tcPr>
+            <w:tcW w:type="dxa" w:w="5760"/>
+            <w:tcBorders>
+              <w:top w:val="single" w:color="CCCCCC" w:sz="4"/>
+              <w:left w:val="single" w:color="CCCCCC" w:sz="4"/>
+              <w:bottom w:val="single" w:color="CCCCCC" w:sz="4"/>
+              <w:right w:val="single" w:color="CCCCCC" w:sz="4"/>
+            </w:tcBorders>
+            <w:tcMar>
+              <w:top w:type="dxa" w:w="100"/>
+              <w:left w:type="dxa" w:w="120"/>
+              <w:bottom w:type="dxa" w:w="100"/>
+              <w:right w:type="dxa" w:w="120"/>
+            </w:tcMar>
+            <w:vAlign w:val="center"/>
+          </w:tcPr>
+          <w:p>
+            <w:pPr>
+              <w:jc w:val="left"/>
+            </w:pPr>
+            <w:r>
+              <w:rPr>
+                <w:b w:val="false"/>
+                <w:bCs w:val="false"/>
+                <w:i w:val="false"/>
+                <w:iCs w:val="false"/>
+                <w:sz w:val="19"/>
+                <w:szCs w:val="19"/>
+              </w:rPr>
+              <w:t xml:space="preserve">Certificação/selo de qualidade Anatel e instrumentos correlatos de aferição pública de desempenho, citados junto ao RQUAL.</w:t>
+            </w:r>
+          </w:p>
+        </w:tc>
+      </w:tr>
+      <w:tr>
+        <w:tc>
+          <w:tcPr>
+            <w:tcW w:type="dxa" w:w="2100"/>
+            <w:tcBorders>
+              <w:top w:val="single" w:color="CCCCCC" w:sz="4"/>
+              <w:left w:val="single" w:color="CCCCCC" w:sz="4"/>
+              <w:bottom w:val="single" w:color="CCCCCC" w:sz="4"/>
+              <w:right w:val="single" w:color="CCCCCC" w:sz="4"/>
+            </w:tcBorders>
+            <w:tcMar>
+              <w:top w:type="dxa" w:w="100"/>
+              <w:left w:type="dxa" w:w="120"/>
+              <w:bottom w:type="dxa" w:w="100"/>
+              <w:right w:type="dxa" w:w="120"/>
+            </w:tcMar>
+            <w:vAlign w:val="center"/>
+          </w:tcPr>
+          <w:p>
+            <w:pPr>
+              <w:jc w:val="left"/>
+            </w:pPr>
+            <w:r>
+              <w:rPr>
+                <w:b/>
+                <w:bCs/>
+                <w:i w:val="false"/>
+                <w:iCs w:val="false"/>
+                <w:sz w:val="19"/>
+                <w:szCs w:val="19"/>
+              </w:rPr>
+              <w:t xml:space="preserve">SLA</w:t>
+            </w:r>
+          </w:p>
+        </w:tc>
+        <w:tc>
+          <w:tcPr>
+            <w:tcW w:type="dxa" w:w="1500"/>
+            <w:tcBorders>
+              <w:top w:val="single" w:color="CCCCCC" w:sz="4"/>
+              <w:left w:val="single" w:color="CCCCCC" w:sz="4"/>
+              <w:bottom w:val="single" w:color="CCCCCC" w:sz="4"/>
+              <w:right w:val="single" w:color="CCCCCC" w:sz="4"/>
+            </w:tcBorders>
+            <w:tcMar>
+              <w:top w:type="dxa" w:w="100"/>
+              <w:left w:type="dxa" w:w="120"/>
+              <w:bottom w:type="dxa" w:w="100"/>
+              <w:right w:type="dxa" w:w="120"/>
+            </w:tcMar>
+            <w:vAlign w:val="center"/>
+          </w:tcPr>
+          <w:p>
+            <w:pPr>
+              <w:jc w:val="left"/>
+            </w:pPr>
+            <w:r>
+              <w:rPr>
+                <w:b w:val="false"/>
+                <w:bCs w:val="false"/>
+                <w:i w:val="false"/>
+                <w:iCs w:val="false"/>
+                <w:color w:val="4A6A8A"/>
+                <w:sz w:val="19"/>
+                <w:szCs w:val="19"/>
+              </w:rPr>
+              <w:t xml:space="preserve">Sigla</w:t>
+            </w:r>
+          </w:p>
+        </w:tc>
+        <w:tc>
+          <w:tcPr>
+            <w:tcW w:type="dxa" w:w="5760"/>
+            <w:tcBorders>
+              <w:top w:val="single" w:color="CCCCCC" w:sz="4"/>
+              <w:left w:val="single" w:color="CCCCCC" w:sz="4"/>
+              <w:bottom w:val="single" w:color="CCCCCC" w:sz="4"/>
+              <w:right w:val="single" w:color="CCCCCC" w:sz="4"/>
+            </w:tcBorders>
+            <w:tcMar>
+              <w:top w:type="dxa" w:w="100"/>
+              <w:left w:type="dxa" w:w="120"/>
+              <w:bottom w:type="dxa" w:w="100"/>
+              <w:right w:type="dxa" w:w="120"/>
+            </w:tcMar>
+            <w:vAlign w:val="center"/>
+          </w:tcPr>
+          <w:p>
+            <w:pPr>
+              <w:jc w:val="left"/>
+            </w:pPr>
+            <w:r>
+              <w:rPr>
+                <w:b w:val="false"/>
+                <w:bCs w:val="false"/>
+                <w:i w:val="false"/>
+                <w:iCs w:val="false"/>
+                <w:sz w:val="19"/>
+                <w:szCs w:val="19"/>
+              </w:rPr>
+              <w:t xml:space="preserve">Service Level Agreement — acordo de nível de serviço; insumo de impacto de negócio na priorização de alertas e uma das três hipóteses de uso da Consulta Individual.</w:t>
+            </w:r>
+          </w:p>
+        </w:tc>
+      </w:tr>
+      <w:tr>
+        <w:tc>
+          <w:tcPr>
+            <w:tcW w:type="dxa" w:w="2100"/>
+            <w:tcBorders>
+              <w:top w:val="single" w:color="CCCCCC" w:sz="4"/>
+              <w:left w:val="single" w:color="CCCCCC" w:sz="4"/>
+              <w:bottom w:val="single" w:color="CCCCCC" w:sz="4"/>
+              <w:right w:val="single" w:color="CCCCCC" w:sz="4"/>
+            </w:tcBorders>
+            <w:tcMar>
+              <w:top w:type="dxa" w:w="100"/>
+              <w:left w:type="dxa" w:w="120"/>
+              <w:bottom w:type="dxa" w:w="100"/>
+              <w:right w:type="dxa" w:w="120"/>
+            </w:tcMar>
+            <w:vAlign w:val="center"/>
+          </w:tcPr>
+          <w:p>
+            <w:pPr>
+              <w:jc w:val="left"/>
+            </w:pPr>
+            <w:r>
+              <w:rPr>
+                <w:b/>
+                <w:bCs/>
+                <w:i w:val="false"/>
+                <w:iCs w:val="false"/>
+                <w:sz w:val="19"/>
+                <w:szCs w:val="19"/>
+              </w:rPr>
+              <w:t xml:space="preserve">SPOF</w:t>
+            </w:r>
+          </w:p>
+        </w:tc>
+        <w:tc>
+          <w:tcPr>
+            <w:tcW w:type="dxa" w:w="1500"/>
+            <w:tcBorders>
+              <w:top w:val="single" w:color="CCCCCC" w:sz="4"/>
+              <w:left w:val="single" w:color="CCCCCC" w:sz="4"/>
+              <w:bottom w:val="single" w:color="CCCCCC" w:sz="4"/>
+              <w:right w:val="single" w:color="CCCCCC" w:sz="4"/>
+            </w:tcBorders>
+            <w:tcMar>
+              <w:top w:type="dxa" w:w="100"/>
+              <w:left w:type="dxa" w:w="120"/>
+              <w:bottom w:type="dxa" w:w="100"/>
+              <w:right w:type="dxa" w:w="120"/>
+            </w:tcMar>
+            <w:vAlign w:val="center"/>
+          </w:tcPr>
+          <w:p>
+            <w:pPr>
+              <w:jc w:val="left"/>
+            </w:pPr>
+            <w:r>
+              <w:rPr>
+                <w:b w:val="false"/>
+                <w:bCs w:val="false"/>
+                <w:i w:val="false"/>
+                <w:iCs w:val="false"/>
+                <w:color w:val="4A6A8A"/>
+                <w:sz w:val="19"/>
+                <w:szCs w:val="19"/>
+              </w:rPr>
+              <w:t xml:space="preserve">Sigla</w:t>
+            </w:r>
+          </w:p>
+        </w:tc>
+        <w:tc>
+          <w:tcPr>
+            <w:tcW w:type="dxa" w:w="5760"/>
+            <w:tcBorders>
+              <w:top w:val="single" w:color="CCCCCC" w:sz="4"/>
+              <w:left w:val="single" w:color="CCCCCC" w:sz="4"/>
+              <w:bottom w:val="single" w:color="CCCCCC" w:sz="4"/>
+              <w:right w:val="single" w:color="CCCCCC" w:sz="4"/>
+            </w:tcBorders>
+            <w:tcMar>
+              <w:top w:type="dxa" w:w="100"/>
+              <w:left w:type="dxa" w:w="120"/>
+              <w:bottom w:type="dxa" w:w="100"/>
+              <w:right w:type="dxa" w:w="120"/>
+            </w:tcMar>
+            <w:vAlign w:val="center"/>
+          </w:tcPr>
+          <w:p>
+            <w:pPr>
+              <w:jc w:val="left"/>
+            </w:pPr>
+            <w:r>
+              <w:rPr>
+                <w:b w:val="false"/>
+                <w:bCs w:val="false"/>
+                <w:i w:val="false"/>
+                <w:iCs w:val="false"/>
+                <w:sz w:val="19"/>
+                <w:szCs w:val="19"/>
+              </w:rPr>
+              <w:t xml:space="preserve">Single Point of Failure — enlace/nó sem redundância; base do cálculo de blast radius e da priorização de alertas.</w:t>
+            </w:r>
+          </w:p>
+        </w:tc>
+      </w:tr>
+      <w:tr>
+        <w:tc>
+          <w:tcPr>
+            <w:tcW w:type="dxa" w:w="2100"/>
+            <w:tcBorders>
+              <w:top w:val="single" w:color="CCCCCC" w:sz="4"/>
+              <w:left w:val="single" w:color="CCCCCC" w:sz="4"/>
+              <w:bottom w:val="single" w:color="CCCCCC" w:sz="4"/>
+              <w:right w:val="single" w:color="CCCCCC" w:sz="4"/>
+            </w:tcBorders>
+            <w:tcMar>
+              <w:top w:type="dxa" w:w="100"/>
+              <w:left w:type="dxa" w:w="120"/>
+              <w:bottom w:type="dxa" w:w="100"/>
+              <w:right w:type="dxa" w:w="120"/>
+            </w:tcMar>
+            <w:vAlign w:val="center"/>
+          </w:tcPr>
+          <w:p>
+            <w:pPr>
+              <w:jc w:val="left"/>
+            </w:pPr>
+            <w:r>
+              <w:rPr>
+                <w:b/>
+                <w:bCs/>
+                <w:i w:val="false"/>
+                <w:iCs w:val="false"/>
+                <w:sz w:val="19"/>
+                <w:szCs w:val="19"/>
+              </w:rPr>
+              <w:t xml:space="preserve">TM Forum</w:t>
+            </w:r>
+          </w:p>
+        </w:tc>
+        <w:tc>
+          <w:tcPr>
+            <w:tcW w:type="dxa" w:w="1500"/>
+            <w:tcBorders>
+              <w:top w:val="single" w:color="CCCCCC" w:sz="4"/>
+              <w:left w:val="single" w:color="CCCCCC" w:sz="4"/>
+              <w:bottom w:val="single" w:color="CCCCCC" w:sz="4"/>
+              <w:right w:val="single" w:color="CCCCCC" w:sz="4"/>
+            </w:tcBorders>
+            <w:tcMar>
+              <w:top w:type="dxa" w:w="100"/>
+              <w:left w:type="dxa" w:w="120"/>
+              <w:bottom w:type="dxa" w:w="100"/>
+              <w:right w:type="dxa" w:w="120"/>
+            </w:tcMar>
+            <w:vAlign w:val="center"/>
+          </w:tcPr>
+          <w:p>
+            <w:pPr>
+              <w:jc w:val="left"/>
+            </w:pPr>
+            <w:r>
+              <w:rPr>
+                <w:b w:val="false"/>
+                <w:bCs w:val="false"/>
+                <w:i w:val="false"/>
+                <w:iCs w:val="false"/>
+                <w:color w:val="4A6A8A"/>
+                <w:sz w:val="19"/>
+                <w:szCs w:val="19"/>
+              </w:rPr>
+              <w:t xml:space="preserve">Sigla</w:t>
+            </w:r>
+          </w:p>
+        </w:tc>
+        <w:tc>
+          <w:tcPr>
+            <w:tcW w:type="dxa" w:w="5760"/>
+            <w:tcBorders>
+              <w:top w:val="single" w:color="CCCCCC" w:sz="4"/>
+              <w:left w:val="single" w:color="CCCCCC" w:sz="4"/>
+              <w:bottom w:val="single" w:color="CCCCCC" w:sz="4"/>
+              <w:right w:val="single" w:color="CCCCCC" w:sz="4"/>
+            </w:tcBorders>
+            <w:tcMar>
+              <w:top w:type="dxa" w:w="100"/>
+              <w:left w:type="dxa" w:w="120"/>
+              <w:bottom w:type="dxa" w:w="100"/>
+              <w:right w:type="dxa" w:w="120"/>
+            </w:tcMar>
+            <w:vAlign w:val="center"/>
+          </w:tcPr>
+          <w:p>
+            <w:pPr>
+              <w:jc w:val="left"/>
+            </w:pPr>
+            <w:r>
+              <w:rPr>
+                <w:b w:val="false"/>
+                <w:bCs w:val="false"/>
+                <w:i w:val="false"/>
+                <w:iCs w:val="false"/>
+                <w:sz w:val="19"/>
+                <w:szCs w:val="19"/>
+              </w:rPr>
+              <w:t xml:space="preserve">TeleManagement Forum — origem do eTOM (GB921) e das Open APIs TMF628/TMF642 citadas como referência de interoperabilidade futura.</w:t>
+            </w:r>
+          </w:p>
+        </w:tc>
+      </w:tr>
+      <w:tr>
+        <w:tc>
+          <w:tcPr>
+            <w:tcW w:type="dxa" w:w="2100"/>
+            <w:tcBorders>
+              <w:top w:val="single" w:color="CCCCCC" w:sz="4"/>
+              <w:left w:val="single" w:color="CCCCCC" w:sz="4"/>
+              <w:bottom w:val="single" w:color="CCCCCC" w:sz="4"/>
+              <w:right w:val="single" w:color="CCCCCC" w:sz="4"/>
+            </w:tcBorders>
+            <w:tcMar>
+              <w:top w:type="dxa" w:w="100"/>
+              <w:left w:type="dxa" w:w="120"/>
+              <w:bottom w:type="dxa" w:w="100"/>
+              <w:right w:type="dxa" w:w="120"/>
+            </w:tcMar>
+            <w:vAlign w:val="center"/>
+          </w:tcPr>
+          <w:p>
+            <w:pPr>
+              <w:jc w:val="left"/>
+            </w:pPr>
+            <w:r>
+              <w:rPr>
+                <w:b/>
+                <w:bCs/>
+                <w:i w:val="false"/>
+                <w:iCs w:val="false"/>
+                <w:sz w:val="19"/>
+                <w:szCs w:val="19"/>
+              </w:rPr>
+              <w:t xml:space="preserve">TMF628</w:t>
+            </w:r>
+          </w:p>
+        </w:tc>
+        <w:tc>
+          <w:tcPr>
+            <w:tcW w:type="dxa" w:w="1500"/>
+            <w:tcBorders>
+              <w:top w:val="single" w:color="CCCCCC" w:sz="4"/>
+              <w:left w:val="single" w:color="CCCCCC" w:sz="4"/>
+              <w:bottom w:val="single" w:color="CCCCCC" w:sz="4"/>
+              <w:right w:val="single" w:color="CCCCCC" w:sz="4"/>
+            </w:tcBorders>
+            <w:tcMar>
+              <w:top w:type="dxa" w:w="100"/>
+              <w:left w:type="dxa" w:w="120"/>
+              <w:bottom w:type="dxa" w:w="100"/>
+              <w:right w:type="dxa" w:w="120"/>
+            </w:tcMar>
+            <w:vAlign w:val="center"/>
+          </w:tcPr>
+          <w:p>
+            <w:pPr>
+              <w:jc w:val="left"/>
+            </w:pPr>
+            <w:r>
+              <w:rPr>
+                <w:b w:val="false"/>
+                <w:bCs w:val="false"/>
+                <w:i w:val="false"/>
+                <w:iCs w:val="false"/>
+                <w:color w:val="4A6A8A"/>
+                <w:sz w:val="19"/>
+                <w:szCs w:val="19"/>
+              </w:rPr>
+              <w:t xml:space="preserve">Sigla</w:t>
+            </w:r>
+          </w:p>
+        </w:tc>
+        <w:tc>
+          <w:tcPr>
+            <w:tcW w:type="dxa" w:w="5760"/>
+            <w:tcBorders>
+              <w:top w:val="single" w:color="CCCCCC" w:sz="4"/>
+              <w:left w:val="single" w:color="CCCCCC" w:sz="4"/>
+              <w:bottom w:val="single" w:color="CCCCCC" w:sz="4"/>
+              <w:right w:val="single" w:color="CCCCCC" w:sz="4"/>
+            </w:tcBorders>
+            <w:tcMar>
+              <w:top w:type="dxa" w:w="100"/>
+              <w:left w:type="dxa" w:w="120"/>
+              <w:bottom w:type="dxa" w:w="100"/>
+              <w:right w:type="dxa" w:w="120"/>
+            </w:tcMar>
+            <w:vAlign w:val="center"/>
+          </w:tcPr>
+          <w:p>
+            <w:pPr>
+              <w:jc w:val="left"/>
+            </w:pPr>
+            <w:r>
+              <w:rPr>
+                <w:b w:val="false"/>
+                <w:bCs w:val="false"/>
+                <w:i w:val="false"/>
+                <w:iCs w:val="false"/>
+                <w:sz w:val="19"/>
+                <w:szCs w:val="19"/>
+              </w:rPr>
+              <w:t xml:space="preserve">TM Forum Open API — Performance Management; citada como referência de interoperabilidade futura, não implementada.</w:t>
+            </w:r>
+          </w:p>
+        </w:tc>
+      </w:tr>
+      <w:tr>
+        <w:tc>
+          <w:tcPr>
+            <w:tcW w:type="dxa" w:w="2100"/>
+            <w:tcBorders>
+              <w:top w:val="single" w:color="CCCCCC" w:sz="4"/>
+              <w:left w:val="single" w:color="CCCCCC" w:sz="4"/>
+              <w:bottom w:val="single" w:color="CCCCCC" w:sz="4"/>
+              <w:right w:val="single" w:color="CCCCCC" w:sz="4"/>
+            </w:tcBorders>
+            <w:tcMar>
+              <w:top w:type="dxa" w:w="100"/>
+              <w:left w:type="dxa" w:w="120"/>
+              <w:bottom w:type="dxa" w:w="100"/>
+              <w:right w:type="dxa" w:w="120"/>
+            </w:tcMar>
+            <w:vAlign w:val="center"/>
+          </w:tcPr>
+          <w:p>
+            <w:pPr>
+              <w:jc w:val="left"/>
+            </w:pPr>
+            <w:r>
+              <w:rPr>
+                <w:b/>
+                <w:bCs/>
+                <w:i w:val="false"/>
+                <w:iCs w:val="false"/>
+                <w:sz w:val="19"/>
+                <w:szCs w:val="19"/>
+              </w:rPr>
+              <w:t xml:space="preserve">TMF642</w:t>
+            </w:r>
+          </w:p>
+        </w:tc>
+        <w:tc>
+          <w:tcPr>
+            <w:tcW w:type="dxa" w:w="1500"/>
+            <w:tcBorders>
+              <w:top w:val="single" w:color="CCCCCC" w:sz="4"/>
+              <w:left w:val="single" w:color="CCCCCC" w:sz="4"/>
+              <w:bottom w:val="single" w:color="CCCCCC" w:sz="4"/>
+              <w:right w:val="single" w:color="CCCCCC" w:sz="4"/>
+            </w:tcBorders>
+            <w:tcMar>
+              <w:top w:type="dxa" w:w="100"/>
+              <w:left w:type="dxa" w:w="120"/>
+              <w:bottom w:type="dxa" w:w="100"/>
+              <w:right w:type="dxa" w:w="120"/>
+            </w:tcMar>
+            <w:vAlign w:val="center"/>
+          </w:tcPr>
+          <w:p>
+            <w:pPr>
+              <w:jc w:val="left"/>
+            </w:pPr>
+            <w:r>
+              <w:rPr>
+                <w:b w:val="false"/>
+                <w:bCs w:val="false"/>
+                <w:i w:val="false"/>
+                <w:iCs w:val="false"/>
+                <w:color w:val="4A6A8A"/>
+                <w:sz w:val="19"/>
+                <w:szCs w:val="19"/>
+              </w:rPr>
+              <w:t xml:space="preserve">Sigla</w:t>
+            </w:r>
+          </w:p>
+        </w:tc>
+        <w:tc>
+          <w:tcPr>
+            <w:tcW w:type="dxa" w:w="5760"/>
+            <w:tcBorders>
+              <w:top w:val="single" w:color="CCCCCC" w:sz="4"/>
+              <w:left w:val="single" w:color="CCCCCC" w:sz="4"/>
+              <w:bottom w:val="single" w:color="CCCCCC" w:sz="4"/>
+              <w:right w:val="single" w:color="CCCCCC" w:sz="4"/>
+            </w:tcBorders>
+            <w:tcMar>
+              <w:top w:type="dxa" w:w="100"/>
+              <w:left w:type="dxa" w:w="120"/>
+              <w:bottom w:type="dxa" w:w="100"/>
+              <w:right w:type="dxa" w:w="120"/>
+            </w:tcMar>
+            <w:vAlign w:val="center"/>
+          </w:tcPr>
+          <w:p>
+            <w:pPr>
+              <w:jc w:val="left"/>
+            </w:pPr>
+            <w:r>
+              <w:rPr>
+                <w:b w:val="false"/>
+                <w:bCs w:val="false"/>
+                <w:i w:val="false"/>
+                <w:iCs w:val="false"/>
+                <w:sz w:val="19"/>
+                <w:szCs w:val="19"/>
+              </w:rPr>
+              <w:t xml:space="preserve">TM Forum Open API — Alarm Management; citada como referência de interoperabilidade futura, não implementada.</w:t>
+            </w:r>
+          </w:p>
+        </w:tc>
+      </w:tr>
+    </w:tbl>
+    <w:p>
+      <w:pPr>
+        <w:spacing w:after="0" w:before="0"/>
+        <w:jc w:val="both"/>
+      </w:pPr>
+      <w:r>
+        <w:rPr>
+          <w:b w:val="false"/>
+          <w:bCs w:val="false"/>
+          <w:i w:val="false"/>
+          <w:iCs w:val="false"/>
+        </w:rPr>
+        <w:t xml:space="preserve">Termos institucionais recorrentes em toda a série de documentos da Lounge de Soluções ISP (RAG, SLM, LGPD, ITU-T, TM Forum, eTOM) seguem a mesma definição em todos os Product Reports desta série, por força do padrão de documentação da Vísent (docs/PADRAO_DOCUMENTACAO_PRODUTO.md).</w:t>
+      </w:r>
+    </w:p>
     <w:sectPr>
       <w:headerReference w:type="default" r:id="rId9"/>
       <w:footerReference w:type="default" r:id="rId10"/>

</xml_diff>